<commit_message>
docs(tests): update CP-42 and the cancel case after the role change was removed
</commit_message>
<xml_diff>
--- a/06_DOCUMENTACION_DE_PRUEBAS/EN/WORD/06_Test_Documentation.docx
+++ b/06_DOCUMENTACION_DE_PRUEBAS/EN/WORD/06_Test_Documentation.docx
@@ -196,7 +196,7 @@
               <w:pStyle w:val="Compact"/>
             </w:pPr>
             <w:r>
-              <w:t xml:space="preserve">Brayan Estiven Patiño Cabrera, Juan Camilo Guilombo Osorio, Merari Urbano</w:t>
+              <w:t xml:space="preserve">Brayan Estiven Patiño Cabrera, Juan Camilo Guilombo Osorio, Merari Urbano Quintero</w:t>
             </w:r>
           </w:p>
         </w:tc>
@@ -268,7 +268,7 @@
               <w:pStyle w:val="Compact"/>
             </w:pPr>
             <w:r>
-              <w:t xml:space="preserve">October 19, 2026</w:t>
+              <w:t xml:space="preserve">October 20, 2026</w:t>
             </w:r>
           </w:p>
         </w:tc>
@@ -279,7 +279,7 @@
         <w:pStyle w:val="BodyText"/>
       </w:pPr>
       <w:r>
-        <w:t xml:space="preserve">This document gathers the test plan, the inventory of automated tests in the repositories, their actual results when run on October 19, 2026 (including the end-to-end, performance, and responsive design tests against the complete system), and the 42 functional test cases, run the same day, traced to the SRS v7.4 requirements (</w:t>
+        <w:t xml:space="preserve">This document gathers the test plan, the inventory of automated tests in the repositories, their actual results when run on October 19, 2026 (including the end-to-end, performance, and responsive design tests against the complete system), and the 42 functional test cases, run the same day, traced to the SRS v7.6 requirements (</w:t>
       </w:r>
       <w:r>
         <w:rPr>
@@ -288,7 +288,7 @@
         <w:t xml:space="preserve">lavarapido-docs/01_INFORME_DE_ESPECIFICACION_DE_REQUISITOS</w:t>
       </w:r>
       <w:r>
-        <w:t xml:space="preserve">). Its structure follows the ISO/IEC/IEEE 29119-3 standard for test documentation (International Organization for Standardization [ISO], 2021). No result in this document is assumed.</w:t>
+        <w:t xml:space="preserve">). On October 20, 2026, the inventory, case CP-42 and the traceability matrix were adjusted because the role change of an account was reverted in the code that day, and the wording of CP-10 because the customer cancels without writing a reason. Its structure follows the ISO/IEC/IEEE 29119-3 standard for test documentation (International Organization for Standardization [ISO], 2021). No result in this document is assumed.</w:t>
       </w:r>
     </w:p>
     <w:bookmarkEnd w:id="20"/>
@@ -895,7 +895,7 @@
               <w:pStyle w:val="Compact"/>
             </w:pPr>
             <w:r>
-              <w:t xml:space="preserve">Cases CP-01 to CP-33 (section 4)</w:t>
+              <w:t xml:space="preserve">Cases CP-01 to CP-42 (section 4)</w:t>
             </w:r>
           </w:p>
         </w:tc>
@@ -1406,7 +1406,7 @@
         <w:pStyle w:val="FirstParagraph"/>
       </w:pPr>
       <w:r>
-        <w:t xml:space="preserve">The repositories have 550 test methods: 507 in the backend and 43 in the web. The mobile app has no automated tests; it is checked with the TypeScript build and the screen walk-through (section 3.2).</w:t>
+        <w:t xml:space="preserve">As of October 20, 2026, the repositories have 548 test methods: 505 in the backend and 43 in the web. The mobile app has no automated tests; it is checked with the TypeScript build and the screen walk-through (section 3.2).</w:t>
       </w:r>
     </w:p>
     <w:p>
@@ -1720,18 +1720,18 @@
               <w:pStyle w:val="Compact"/>
             </w:pPr>
             <w:r>
-              <w:t xml:space="preserve">135</w:t>
-            </w:r>
-          </w:p>
-        </w:tc>
-        <w:tc>
-          <w:tcPr/>
-          <w:p>
-            <w:pPr>
-              <w:pStyle w:val="Compact"/>
-            </w:pPr>
-            <w:r>
-              <w:t xml:space="preserve">Registration, sign-in with lockout after failed attempts, password recovery, profile and address, user administration and role change, roles and permissions, preferences, value objects, password policy, JWT issuing and HTTP security by role (</w:t>
+              <w:t xml:space="preserve">133</w:t>
+            </w:r>
+          </w:p>
+        </w:tc>
+        <w:tc>
+          <w:tcPr/>
+          <w:p>
+            <w:pPr>
+              <w:pStyle w:val="Compact"/>
+            </w:pPr>
+            <w:r>
+              <w:t xml:space="preserve">Registration, sign-in with lockout after failed attempts, password recovery, profile and address, user administration (including the rule that an administrator account cannot be deactivated), roles and permissions, preferences, value objects, password policy, JWT issuing and HTTP security by role (</w:t>
             </w:r>
             <w:r>
               <w:rPr>
@@ -2284,7 +2284,31 @@
         <w:t xml:space="preserve"> </w:t>
       </w:r>
       <w:r>
-        <w:t xml:space="preserve">database.</w:t>
+        <w:t xml:space="preserve">database. When the role change was reverted on October 20, 2 tests left security-service (</w:t>
+      </w:r>
+      <w:r>
+        <w:rPr>
+          <w:rStyle w:val="VerbatimChar"/>
+        </w:rPr>
+        <w:t xml:space="preserve">changingTheRoleReplacesItAndClosesTheSessions</w:t>
+      </w:r>
+      <w:r>
+        <w:t xml:space="preserve"> </w:t>
+      </w:r>
+      <w:r>
+        <w:t xml:space="preserve">and</w:t>
+      </w:r>
+      <w:r>
+        <w:t xml:space="preserve"> </w:t>
+      </w:r>
+      <w:r>
+        <w:rPr>
+          <w:rStyle w:val="VerbatimChar"/>
+        </w:rPr>
+        <w:t xml:space="preserve">nobodyChangesTheirOwnRole</w:t>
+      </w:r>
+      <w:r>
+        <w:t xml:space="preserve">), so that suite now has 2 tests fewer than the 151 in Table 5; Table 5 keeps the real numbers of the October 19 run.</w:t>
       </w:r>
     </w:p>
     <w:p>
@@ -5182,7 +5206,7 @@
         <w:pStyle w:val="FirstParagraph"/>
       </w:pPr>
       <w:r>
-        <w:t xml:space="preserve">Cases CP-01 to CP-33 were defined on SRS v4 and first run on October 9, 2026; cases CP-34 to CP-42 cover the requirements implemented afterwards (RF-004b, RF-008, RF-010, RF-015, RF-022, RF-036, RF-037, and RF-038) and the role change of RF-028. All 42 were run on October 19, 2026, against the full system through the API Gateway (the same calls the web and mobile clients make), with a script that creates its own accounts and data and deletes them at the end. All 42 passed (Figure 7).</w:t>
+        <w:t xml:space="preserve">Cases CP-01 to CP-33 were defined on SRS v4 and first run on October 9, 2026; cases CP-34 to CP-42 cover the requirements implemented afterwards (RF-004b, RF-008, RF-010, RF-015, RF-022, RF-036, RF-037, and RF-038) and the administrator accounts of RF-028. All 42 were run on October 19, 2026, against the full system through the API Gateway (the same calls the web and mobile clients make), with a script that creates its own accounts and data and deletes them at the end. All 42 passed (Figure 7).</w:t>
       </w:r>
     </w:p>
     <w:p>
@@ -6402,18 +6426,29 @@
               <w:pStyle w:val="Compact"/>
             </w:pPr>
             <w:r>
-              <w:t xml:space="preserve">Cancel with a reason</w:t>
-            </w:r>
-          </w:p>
-        </w:tc>
-        <w:tc>
-          <w:tcPr/>
-          <w:p>
-            <w:pPr>
-              <w:pStyle w:val="Compact"/>
-            </w:pPr>
-            <w:r>
-              <w:t xml:space="preserve">Reason</w:t>
+              <w:t xml:space="preserve">Cancel as the customer (the customer writes no reason)</w:t>
+            </w:r>
+          </w:p>
+        </w:tc>
+        <w:tc>
+          <w:tcPr/>
+          <w:p>
+            <w:pPr>
+              <w:pStyle w:val="Compact"/>
+            </w:pPr>
+            <w:r>
+              <w:t xml:space="preserve">—</w:t>
+            </w:r>
+          </w:p>
+        </w:tc>
+        <w:tc>
+          <w:tcPr/>
+          <w:p>
+            <w:pPr>
+              <w:pStyle w:val="Compact"/>
+            </w:pPr>
+            <w:r>
+              <w:t xml:space="preserve">Booking is CANCELLED with the reason</w:t>
             </w:r>
             <w:r>
               <w:t xml:space="preserve"> </w:t>
@@ -6424,16 +6459,11 @@
               </w:rPr>
               <w:t xml:space="preserve">CUSTOMER_REQUEST</w:t>
             </w:r>
-          </w:p>
-        </w:tc>
-        <w:tc>
-          <w:tcPr/>
-          <w:p>
-            <w:pPr>
-              <w:pStyle w:val="Compact"/>
-            </w:pPr>
-            <w:r>
-              <w:t xml:space="preserve">Booking is CANCELLED with the reason stored</w:t>
+            <w:r>
+              <w:t xml:space="preserve"> </w:t>
+            </w:r>
+            <w:r>
+              <w:t xml:space="preserve">set by the system</w:t>
             </w:r>
           </w:p>
         </w:tc>
@@ -9825,74 +9855,62 @@
               <w:pStyle w:val="Compact"/>
             </w:pPr>
             <w:r>
-              <w:t xml:space="preserve">Role change and administrator accounts</w:t>
-            </w:r>
-          </w:p>
-        </w:tc>
-        <w:tc>
-          <w:tcPr/>
-          <w:p>
-            <w:pPr>
-              <w:pStyle w:val="Compact"/>
-            </w:pPr>
-            <w:r>
-              <w:t xml:space="preserve">Test administrator and operator</w:t>
-            </w:r>
-          </w:p>
-        </w:tc>
-        <w:tc>
-          <w:tcPr/>
-          <w:p>
-            <w:pPr>
-              <w:pStyle w:val="Compact"/>
-            </w:pPr>
-            <w:r>
-              <w:t xml:space="preserve">Try to change one's own role, disable an administrator, and turn an operator into a customer</w:t>
-            </w:r>
-          </w:p>
-        </w:tc>
-        <w:tc>
-          <w:tcPr/>
-          <w:p>
-            <w:pPr>
-              <w:pStyle w:val="Compact"/>
-            </w:pPr>
-            <w:r>
-              <w:t xml:space="preserve">Roles</w:t>
-            </w:r>
-          </w:p>
-        </w:tc>
-        <w:tc>
-          <w:tcPr/>
-          <w:p>
-            <w:pPr>
-              <w:pStyle w:val="Compact"/>
-            </w:pPr>
-            <w:r>
-              <w:t xml:space="preserve">The first two are rejected; the role change closes the user's sessions</w:t>
-            </w:r>
-          </w:p>
-        </w:tc>
-        <w:tc>
-          <w:tcPr/>
-          <w:p>
-            <w:pPr>
-              <w:pStyle w:val="Compact"/>
-            </w:pPr>
-            <w:r>
-              <w:t xml:space="preserve">Changing their own role: 403</w:t>
-            </w:r>
-            <w:r>
-              <w:t xml:space="preserve"> </w:t>
-            </w:r>
-            <w:r>
-              <w:rPr>
-                <w:rStyle w:val="VerbatimChar"/>
-              </w:rPr>
-              <w:t xml:space="preserve">CANNOT_CHANGE_OWN_ROLE</w:t>
-            </w:r>
-            <w:r>
-              <w:t xml:space="preserve">; disabling an administrator: 403</w:t>
+              <w:t xml:space="preserve">An administrator account cannot be deactivated</w:t>
+            </w:r>
+          </w:p>
+        </w:tc>
+        <w:tc>
+          <w:tcPr/>
+          <w:p>
+            <w:pPr>
+              <w:pStyle w:val="Compact"/>
+            </w:pPr>
+            <w:r>
+              <w:t xml:space="preserve">Administrator session</w:t>
+            </w:r>
+          </w:p>
+        </w:tc>
+        <w:tc>
+          <w:tcPr/>
+          <w:p>
+            <w:pPr>
+              <w:pStyle w:val="Compact"/>
+            </w:pPr>
+            <w:r>
+              <w:t xml:space="preserve">Try to deactivate an administrator account</w:t>
+            </w:r>
+          </w:p>
+        </w:tc>
+        <w:tc>
+          <w:tcPr/>
+          <w:p>
+            <w:pPr>
+              <w:pStyle w:val="Compact"/>
+            </w:pPr>
+            <w:r>
+              <w:t xml:space="preserve">—</w:t>
+            </w:r>
+          </w:p>
+        </w:tc>
+        <w:tc>
+          <w:tcPr/>
+          <w:p>
+            <w:pPr>
+              <w:pStyle w:val="Compact"/>
+            </w:pPr>
+            <w:r>
+              <w:t xml:space="preserve">Rejected: an administrator account cannot be deactivated</w:t>
+            </w:r>
+          </w:p>
+        </w:tc>
+        <w:tc>
+          <w:tcPr/>
+          <w:p>
+            <w:pPr>
+              <w:pStyle w:val="Compact"/>
+            </w:pPr>
+            <w:r>
+              <w:t xml:space="preserve">403</w:t>
             </w:r>
             <w:r>
               <w:t xml:space="preserve"> </w:t>
@@ -9902,9 +9920,6 @@
                 <w:rStyle w:val="VerbatimChar"/>
               </w:rPr>
               <w:t xml:space="preserve">ADMIN_CANNOT_BE_DISABLED</w:t>
-            </w:r>
-            <w:r>
-              <w:t xml:space="preserve">; the operator becomes a customer (200) and their sessions are closed</w:t>
             </w:r>
           </w:p>
         </w:tc>
@@ -9921,6 +9936,39 @@
         </w:tc>
       </w:tr>
     </w:tbl>
+    <w:p>
+      <w:pPr>
+        <w:pStyle w:val="BlockText"/>
+      </w:pPr>
+      <w:r>
+        <w:rPr>
+          <w:i/>
+          <w:iCs/>
+        </w:rPr>
+        <w:t xml:space="preserve">Note.</w:t>
+      </w:r>
+      <w:r>
+        <w:t xml:space="preserve"> </w:t>
+      </w:r>
+      <w:r>
+        <w:t xml:space="preserve">On October 19, CP-42 also tested the role change of an account (403</w:t>
+      </w:r>
+      <w:r>
+        <w:t xml:space="preserve"> </w:t>
+      </w:r>
+      <w:r>
+        <w:rPr>
+          <w:rStyle w:val="VerbatimChar"/>
+        </w:rPr>
+        <w:t xml:space="preserve">CANNOT_CHANGE_OWN_ROLE</w:t>
+      </w:r>
+      <w:r>
+        <w:t xml:space="preserve"> </w:t>
+      </w:r>
+      <w:r>
+        <w:t xml:space="preserve">when changing one's own role, and an operator turned into a customer with 200). That part was removed from the case on October 20, 2026, when the feature was reverted in the backend, the web and the app.</w:t>
+      </w:r>
+    </w:p>
     <w:p>
       <w:pPr>
         <w:pStyle w:val="BlockText"/>
@@ -10061,7 +10109,7 @@
         <w:pStyle w:val="FirstParagraph"/>
       </w:pPr>
       <w:r>
-        <w:t xml:space="preserve">Of the 41 requirements in SRS v7.4, 38 have a functional case and 39 a related automated test; RF-032 and RF-034 only have a functional case, and RF-017, RF-023, and RF-025 only an automated test.</w:t>
+        <w:t xml:space="preserve">Of the 41 requirements in SRS v7.6, 38 have a functional case and 39 a related automated test; RF-032 and RF-034 only have a functional case, and RF-017, RF-023, and RF-025 only an automated test.</w:t>
       </w:r>
     </w:p>
     <w:p>
@@ -10903,18 +10951,6 @@
                 <w:rStyle w:val="VerbatimChar"/>
               </w:rPr>
               <w:t xml:space="preserve">PATCH /admin/users/{id}/status</w:t>
-            </w:r>
-            <w:r>
-              <w:t xml:space="preserve">,</w:t>
-            </w:r>
-            <w:r>
-              <w:t xml:space="preserve"> </w:t>
-            </w:r>
-            <w:r>
-              <w:rPr>
-                <w:rStyle w:val="VerbatimChar"/>
-              </w:rPr>
-              <w:t xml:space="preserve">PATCH /admin/users/{id}/role</w:t>
             </w:r>
           </w:p>
         </w:tc>

</xml_diff>

<commit_message>
docs(tests): record the October 21 evening run (707 tests) and the live to-close check in English
</commit_message>
<xml_diff>
--- a/06_DOCUMENTACION_DE_PRUEBAS/EN/WORD/06_Test_Documentation.docx
+++ b/06_DOCUMENTACION_DE_PRUEBAS/EN/WORD/06_Test_Documentation.docx
@@ -268,7 +268,7 @@
               <w:pStyle w:val="Compact"/>
             </w:pPr>
             <w:r>
-              <w:t xml:space="preserve">October 20, 2026</w:t>
+              <w:t xml:space="preserve">October 21, 2026</w:t>
             </w:r>
           </w:p>
         </w:tc>
@@ -279,7 +279,7 @@
         <w:pStyle w:val="BodyText"/>
       </w:pPr>
       <w:r>
-        <w:t xml:space="preserve">This document gathers the test plan, the inventory of automated tests in the repositories, their actual results when run on October 19, 2026 (including the end-to-end, performance, and responsive design tests against the complete system), and the 42 functional test cases, run the same day, traced to the SRS v7.6 requirements (</w:t>
+        <w:t xml:space="preserve">This document gathers the test plan, the inventory of automated tests in the repositories, their actual results when run on October 19, 2026 (including the end-to-end, performance, and responsive design tests against the complete system) and again on October 21, and the 42 functional test cases, run on October 19, traced to the SRS v7.7 requirements (</w:t>
       </w:r>
       <w:r>
         <w:rPr>
@@ -288,7 +288,7 @@
         <w:t xml:space="preserve">lavarapido-docs/01_INFORME_DE_ESPECIFICACION_DE_REQUISITOS</w:t>
       </w:r>
       <w:r>
-        <w:t xml:space="preserve">). On October 20, 2026, the inventory, case CP-42 and the traceability matrix were adjusted because the role change of an account was reverted in the code that day, and the wording of CP-10 because the customer cancels without writing a reason. Its structure follows the ISO/IEC/IEEE 29119-3 standard for test documentation (International Organization for Standardization [ISO], 2021). No result in this document is assumed.</w:t>
+        <w:t xml:space="preserve">). On October 20, 2026, the inventory, case CP-42 and the traceability matrix were adjusted because the role change of an account was reverted in the code that day, and the wording of CP-10 because the customer cancels without writing a reason. On October 21, 2026, two runs of the automated tests and of the 19 end-to-end tests were recorded: the early-morning run (689 tests, all passed) and the evening run (707, all passed), which is the latest. They include the changes of that day: the token of a closed session stops working, operator assignment uses a lock, the receipt has a 2 MB maximum, and, for bookings that ended and nobody closed, the system only cancels a scheduled booking that expired without confirmation and sets to "No-show" a confirmed one that never had an operator; one that had an operator goes to the administrator's "To close" list. Its structure follows the ISO/IEC/IEEE 29119-3 standard for test documentation (International Organization for Standardization [ISO], 2021). No result in this document is assumed.</w:t>
       </w:r>
     </w:p>
     <w:bookmarkEnd w:id="20"/>
@@ -691,29 +691,29 @@
               <w:pStyle w:val="Compact"/>
             </w:pPr>
             <w:r>
-              <w:t xml:space="preserve">Gateway route integration</w:t>
-            </w:r>
-          </w:p>
-        </w:tc>
-        <w:tc>
-          <w:tcPr/>
-          <w:p>
-            <w:pPr>
-              <w:pStyle w:val="Compact"/>
-            </w:pPr>
-            <w:r>
-              <w:t xml:space="preserve">Each public route reaches its service</w:t>
-            </w:r>
-          </w:p>
-        </w:tc>
-        <w:tc>
-          <w:tcPr/>
-          <w:p>
-            <w:pPr>
-              <w:pStyle w:val="Compact"/>
-            </w:pPr>
-            <w:r>
-              <w:t xml:space="preserve">Spring Boot Test</w:t>
+              <w:t xml:space="preserve">Gateway integration</w:t>
+            </w:r>
+          </w:p>
+        </w:tc>
+        <w:tc>
+          <w:tcPr/>
+          <w:p>
+            <w:pPr>
+              <w:pStyle w:val="Compact"/>
+            </w:pPr>
+            <w:r>
+              <w:t xml:space="preserve">Each public route reaches its service and the token of a closed session does not get through</w:t>
+            </w:r>
+          </w:p>
+        </w:tc>
+        <w:tc>
+          <w:tcPr/>
+          <w:p>
+            <w:pPr>
+              <w:pStyle w:val="Compact"/>
+            </w:pPr>
+            <w:r>
+              <w:t xml:space="preserve">Spring Boot Test; for the session, a security-service simulated with the JDK HTTP server</w:t>
             </w:r>
           </w:p>
         </w:tc>
@@ -728,6 +728,18 @@
                 <w:rStyle w:val="VerbatimChar"/>
               </w:rPr>
               <w:t xml:space="preserve">GatewayRoutesTest.java</w:t>
+            </w:r>
+            <w:r>
+              <w:t xml:space="preserve">,</w:t>
+            </w:r>
+            <w:r>
+              <w:t xml:space="preserve"> </w:t>
+            </w:r>
+            <w:r>
+              <w:rPr>
+                <w:rStyle w:val="VerbatimChar"/>
+              </w:rPr>
+              <w:t xml:space="preserve">SessionCheckFilterTest.java</w:t>
             </w:r>
           </w:p>
         </w:tc>
@@ -1406,7 +1418,7 @@
         <w:pStyle w:val="FirstParagraph"/>
       </w:pPr>
       <w:r>
-        <w:t xml:space="preserve">As of October 20, 2026, the repositories have 548 test methods: 505 in the backend and 43 in the web. The mobile app has no automated tests; it is checked with the TypeScript build and the screen walk-through (section 3.2).</w:t>
+        <w:t xml:space="preserve">As of the evening of October 21, 2026, the repositories have 602 test methods: 540 in the backend and 62 in the web. The mobile app has no automated tests; it is checked with the TypeScript build and the screen walk-through (section 3.2).</w:t>
       </w:r>
     </w:p>
     <w:p>
@@ -1624,18 +1636,18 @@
               <w:pStyle w:val="Compact"/>
             </w:pPr>
             <w:r>
-              <w:t xml:space="preserve">1</w:t>
-            </w:r>
-          </w:p>
-        </w:tc>
-        <w:tc>
-          <w:tcPr/>
-          <w:p>
-            <w:pPr>
-              <w:pStyle w:val="Compact"/>
-            </w:pPr>
-            <w:r>
-              <w:t xml:space="preserve">8</w:t>
+              <w:t xml:space="preserve">2</w:t>
+            </w:r>
+          </w:p>
+        </w:tc>
+        <w:tc>
+          <w:tcPr/>
+          <w:p>
+            <w:pPr>
+              <w:pStyle w:val="Compact"/>
+            </w:pPr>
+            <w:r>
+              <w:t xml:space="preserve">14</w:t>
             </w:r>
           </w:p>
         </w:tc>
@@ -1683,6 +1695,15 @@
                 <w:rStyle w:val="VerbatimChar"/>
               </w:rPr>
               <w:t xml:space="preserve">GatewayRoutesTest</w:t>
+            </w:r>
+            <w:r>
+              <w:t xml:space="preserve">); session check: the token of a closed session does not get through, the answer is kept per token, logout drops it, if security-service fails the request goes on, and public routes are not checked (</w:t>
+            </w:r>
+            <w:r>
+              <w:rPr>
+                <w:rStyle w:val="VerbatimChar"/>
+              </w:rPr>
+              <w:t xml:space="preserve">SessionCheckFilterTest</w:t>
             </w:r>
             <w:r>
               <w:t xml:space="preserve">)</w:t>
@@ -1720,18 +1741,18 @@
               <w:pStyle w:val="Compact"/>
             </w:pPr>
             <w:r>
-              <w:t xml:space="preserve">133</w:t>
-            </w:r>
-          </w:p>
-        </w:tc>
-        <w:tc>
-          <w:tcPr/>
-          <w:p>
-            <w:pPr>
-              <w:pStyle w:val="Compact"/>
-            </w:pPr>
-            <w:r>
-              <w:t xml:space="preserve">Registration, sign-in with lockout after failed attempts, password recovery, profile and address, user administration (including the rule that an administrator account cannot be deactivated), roles and permissions, preferences, value objects, password policy, JWT issuing and HTTP security by role (</w:t>
+              <w:t xml:space="preserve">139</w:t>
+            </w:r>
+          </w:p>
+        </w:tc>
+        <w:tc>
+          <w:tcPr/>
+          <w:p>
+            <w:pPr>
+              <w:pStyle w:val="Compact"/>
+            </w:pPr>
+            <w:r>
+              <w:t xml:space="preserve">Registration, sign-in with lockout after failed attempts, password recovery, profile and address, user administration (including the rule that an administrator account cannot be deactivated), roles and permissions, preferences, value objects, password policy, JWT issuing, open and closed sessions (the token of a closed session answers 401), and HTTP security by role (</w:t>
             </w:r>
             <w:r>
               <w:rPr>
@@ -1836,18 +1857,18 @@
               <w:pStyle w:val="Compact"/>
             </w:pPr>
             <w:r>
-              <w:t xml:space="preserve">43</w:t>
-            </w:r>
-          </w:p>
-        </w:tc>
-        <w:tc>
-          <w:tcPr/>
-          <w:p>
-            <w:pPr>
-              <w:pStyle w:val="Compact"/>
-            </w:pPr>
-            <w:r>
-              <w:t xml:space="preserve">Booking life cycle, availability and the reason a time is not available, bays (</w:t>
+              <w:t xml:space="preserve">50</w:t>
+            </w:r>
+          </w:p>
+        </w:tc>
+        <w:tc>
+          <w:tcPr/>
+          <w:p>
+            <w:pPr>
+              <w:pStyle w:val="Compact"/>
+            </w:pPr>
+            <w:r>
+              <w:t xml:space="preserve">Booking life cycle, cancellation of scheduled bookings that expired without confirmation, "No-show" only for an expired confirmed booking that operations requests through the internal route, availability and the reason a time is not available, bays (</w:t>
             </w:r>
             <w:r>
               <w:rPr>
@@ -1889,29 +1910,50 @@
               <w:pStyle w:val="Compact"/>
             </w:pPr>
             <w:r>
-              <w:t xml:space="preserve">11</w:t>
-            </w:r>
-          </w:p>
-        </w:tc>
-        <w:tc>
-          <w:tcPr/>
-          <w:p>
-            <w:pPr>
-              <w:pStyle w:val="Compact"/>
-            </w:pPr>
-            <w:r>
-              <w:t xml:space="preserve">55</w:t>
-            </w:r>
-          </w:p>
-        </w:tc>
-        <w:tc>
-          <w:tcPr/>
-          <w:p>
-            <w:pPr>
-              <w:pStyle w:val="Compact"/>
-            </w:pPr>
-            <w:r>
-              <w:t xml:space="preserve">Manual and automatic assignment, free operators, start window, execution, rating, absences, operator metrics, team summary, operator profile, inspection report and web API</w:t>
+              <w:t xml:space="preserve">13</w:t>
+            </w:r>
+          </w:p>
+        </w:tc>
+        <w:tc>
+          <w:tcPr/>
+          <w:p>
+            <w:pPr>
+              <w:pStyle w:val="Compact"/>
+            </w:pPr>
+            <w:r>
+              <w:t xml:space="preserve">67</w:t>
+            </w:r>
+          </w:p>
+        </w:tc>
+        <w:tc>
+          <w:tcPr/>
+          <w:p>
+            <w:pPr>
+              <w:pStyle w:val="Compact"/>
+            </w:pPr>
+            <w:r>
+              <w:t xml:space="preserve">Manual and automatic assignment (with the assignment lock), a single rule for bookings without an operator, bookings that ended and nobody closed and the "To close" list (</w:t>
+            </w:r>
+            <w:r>
+              <w:rPr>
+                <w:rStyle w:val="VerbatimChar"/>
+              </w:rPr>
+              <w:t xml:space="preserve">FollowUpPolicyTest</w:t>
+            </w:r>
+            <w:r>
+              <w:t xml:space="preserve">,</w:t>
+            </w:r>
+            <w:r>
+              <w:t xml:space="preserve"> </w:t>
+            </w:r>
+            <w:r>
+              <w:rPr>
+                <w:rStyle w:val="VerbatimChar"/>
+              </w:rPr>
+              <w:t xml:space="preserve">FollowUpServiceTest</w:t>
+            </w:r>
+            <w:r>
+              <w:t xml:space="preserve">), free operators, start window, execution, rating, absences, operator metrics, team summary, operator profile, inspection report and web API</w:t>
             </w:r>
           </w:p>
         </w:tc>
@@ -1935,29 +1977,53 @@
               <w:pStyle w:val="Compact"/>
             </w:pPr>
             <w:r>
-              <w:t xml:space="preserve">12</w:t>
-            </w:r>
-          </w:p>
-        </w:tc>
-        <w:tc>
-          <w:tcPr/>
-          <w:p>
-            <w:pPr>
-              <w:pStyle w:val="Compact"/>
-            </w:pPr>
-            <w:r>
-              <w:t xml:space="preserve">106</w:t>
-            </w:r>
-          </w:p>
-        </w:tc>
-        <w:tc>
-          <w:tcPr/>
-          <w:p>
-            <w:pPr>
-              <w:pStyle w:val="Compact"/>
-            </w:pPr>
-            <w:r>
-              <w:t xml:space="preserve">Notification use cases, message factory per event, notices in the account's language, reminders, alerts for bookings without an operator, new version notice, device tokens and admin controller</w:t>
+              <w:t xml:space="preserve">13</w:t>
+            </w:r>
+          </w:p>
+        </w:tc>
+        <w:tc>
+          <w:tcPr/>
+          <w:p>
+            <w:pPr>
+              <w:pStyle w:val="Compact"/>
+            </w:pPr>
+            <w:r>
+              <w:t xml:space="preserve">108</w:t>
+            </w:r>
+          </w:p>
+        </w:tc>
+        <w:tc>
+          <w:tcPr/>
+          <w:p>
+            <w:pPr>
+              <w:pStyle w:val="Compact"/>
+            </w:pPr>
+            <w:r>
+              <w:t xml:space="preserve">Notification use cases, message factory per event, notices in the account's language, reminders, alerts for bookings without an operator, unregistered service notice,</w:t>
+            </w:r>
+            <w:r>
+              <w:t xml:space="preserve"> </w:t>
+            </w:r>
+            <w:r>
+              <w:rPr>
+                <w:rStyle w:val="VerbatimChar"/>
+              </w:rPr>
+              <w:t xml:space="preserve">null</w:t>
+            </w:r>
+            <w:r>
+              <w:t xml:space="preserve"> </w:t>
+            </w:r>
+            <w:r>
+              <w:t xml:space="preserve">fields in the event (</w:t>
+            </w:r>
+            <w:r>
+              <w:rPr>
+                <w:rStyle w:val="VerbatimChar"/>
+              </w:rPr>
+              <w:t xml:space="preserve">DomainEventEnvelopeTest</w:t>
+            </w:r>
+            <w:r>
+              <w:t xml:space="preserve">), new version notice, device tokens and admin controller</w:t>
             </w:r>
           </w:p>
         </w:tc>
@@ -1992,18 +2058,18 @@
               <w:pStyle w:val="Compact"/>
             </w:pPr>
             <w:r>
-              <w:t xml:space="preserve">110</w:t>
-            </w:r>
-          </w:p>
-        </w:tc>
-        <w:tc>
-          <w:tcPr/>
-          <w:p>
-            <w:pPr>
-              <w:pStyle w:val="Compact"/>
-            </w:pPr>
-            <w:r>
-              <w:t xml:space="preserve">Payment and receipt, reused reference, history with filters, promotions, loyalty points, payment policy, command and query services, and 7 persistence tests against SQL Server</w:t>
+              <w:t xml:space="preserve">112</w:t>
+            </w:r>
+          </w:p>
+        </w:tc>
+        <w:tc>
+          <w:tcPr/>
+          <w:p>
+            <w:pPr>
+              <w:pStyle w:val="Compact"/>
+            </w:pPr>
+            <w:r>
+              <w:t xml:space="preserve">Payment and receipt (2 MB maximum), reused reference, history with filters, promotions, loyalty points, payment policy, command and query services, and 7 persistence tests against SQL Server</w:t>
             </w:r>
           </w:p>
         </w:tc>
@@ -2027,18 +2093,18 @@
               <w:pStyle w:val="Compact"/>
             </w:pPr>
             <w:r>
-              <w:t xml:space="preserve">37</w:t>
-            </w:r>
-          </w:p>
-        </w:tc>
-        <w:tc>
-          <w:tcPr/>
-          <w:p>
-            <w:pPr>
-              <w:pStyle w:val="Compact"/>
-            </w:pPr>
-            <w:r>
-              <w:t xml:space="preserve">43</w:t>
+              <w:t xml:space="preserve">41</w:t>
+            </w:r>
+          </w:p>
+        </w:tc>
+        <w:tc>
+          <w:tcPr/>
+          <w:p>
+            <w:pPr>
+              <w:pStyle w:val="Compact"/>
+            </w:pPr>
+            <w:r>
+              <w:t xml:space="preserve">62</w:t>
             </w:r>
           </w:p>
         </w:tc>
@@ -2061,7 +2127,7 @@
               <w:t xml:space="preserve"> </w:t>
             </w:r>
             <w:r>
-              <w:t xml:space="preserve">smoke tests), API error messages, and payment account selection</w:t>
+              <w:t xml:space="preserve">smoke tests), API error messages, payment account selection, session across tabs, bookings without an operator and filters, "To close" list, accounts and fixed roles, reports, and loyalty bar</w:t>
             </w:r>
           </w:p>
         </w:tc>
@@ -2205,7 +2271,7 @@
         <w:pStyle w:val="FirstParagraph"/>
       </w:pPr>
       <w:r>
-        <w:t xml:space="preserve">Backend tests are domain and application tests with in-memory doubles, plus controller tests with MockMvc. Most web tests check that each component is created;</w:t>
+        <w:t xml:space="preserve">Backend tests are domain and application tests with in-memory doubles, plus controller tests with MockMvc. Many web tests only check that each component is created;</w:t>
       </w:r>
       <w:r>
         <w:t xml:space="preserve"> </w:t>
@@ -2217,10 +2283,7 @@
         <w:t xml:space="preserve">api-error.spec.ts</w:t>
       </w:r>
       <w:r>
-        <w:t xml:space="preserve"> </w:t>
-      </w:r>
-      <w:r>
-        <w:t xml:space="preserve">and</w:t>
+        <w:t xml:space="preserve">,</w:t>
       </w:r>
       <w:r>
         <w:t xml:space="preserve"> </w:t>
@@ -2235,7 +2298,82 @@
         <w:t xml:space="preserve"> </w:t>
       </w:r>
       <w:r>
-        <w:t xml:space="preserve">test real rules (the API error messages and the payment account selection).</w:t>
+        <w:t xml:space="preserve">and, since October 21, 2026,</w:t>
+      </w:r>
+      <w:r>
+        <w:t xml:space="preserve"> </w:t>
+      </w:r>
+      <w:r>
+        <w:rPr>
+          <w:rStyle w:val="VerbatimChar"/>
+        </w:rPr>
+        <w:t xml:space="preserve">auth.spec.ts</w:t>
+      </w:r>
+      <w:r>
+        <w:t xml:space="preserve">,</w:t>
+      </w:r>
+      <w:r>
+        <w:t xml:space="preserve"> </w:t>
+      </w:r>
+      <w:r>
+        <w:rPr>
+          <w:rStyle w:val="VerbatimChar"/>
+        </w:rPr>
+        <w:t xml:space="preserve">reservations-store.spec.ts</w:t>
+      </w:r>
+      <w:r>
+        <w:t xml:space="preserve">,</w:t>
+      </w:r>
+      <w:r>
+        <w:t xml:space="preserve"> </w:t>
+      </w:r>
+      <w:r>
+        <w:rPr>
+          <w:rStyle w:val="VerbatimChar"/>
+        </w:rPr>
+        <w:t xml:space="preserve">reservations.spec.ts</w:t>
+      </w:r>
+      <w:r>
+        <w:t xml:space="preserve">,</w:t>
+      </w:r>
+      <w:r>
+        <w:t xml:space="preserve"> </w:t>
+      </w:r>
+      <w:r>
+        <w:rPr>
+          <w:rStyle w:val="VerbatimChar"/>
+        </w:rPr>
+        <w:t xml:space="preserve">management.spec.ts</w:t>
+      </w:r>
+      <w:r>
+        <w:t xml:space="preserve">,</w:t>
+      </w:r>
+      <w:r>
+        <w:t xml:space="preserve"> </w:t>
+      </w:r>
+      <w:r>
+        <w:rPr>
+          <w:rStyle w:val="VerbatimChar"/>
+        </w:rPr>
+        <w:t xml:space="preserve">reports.spec.ts</w:t>
+      </w:r>
+      <w:r>
+        <w:t xml:space="preserve">, and</w:t>
+      </w:r>
+      <w:r>
+        <w:t xml:space="preserve"> </w:t>
+      </w:r>
+      <w:r>
+        <w:rPr>
+          <w:rStyle w:val="VerbatimChar"/>
+        </w:rPr>
+        <w:t xml:space="preserve">dashboard.spec.ts</w:t>
+      </w:r>
+      <w:r>
+        <w:t xml:space="preserve"> </w:t>
+      </w:r>
+      <w:r>
+        <w:t xml:space="preserve">test real rules.</w:t>
       </w:r>
     </w:p>
     <w:bookmarkEnd w:id="26"/>
@@ -2253,7 +2391,7 @@
         <w:pStyle w:val="FirstParagraph"/>
       </w:pPr>
       <w:r>
-        <w:t xml:space="preserve">On October 19, 2026, with the</w:t>
+        <w:t xml:space="preserve">On the evening of October 21, 2026, with the</w:t>
       </w:r>
       <w:r>
         <w:t xml:space="preserve"> </w:t>
@@ -2269,7 +2407,7 @@
         <w:t xml:space="preserve"> </w:t>
       </w:r>
       <w:r>
-        <w:t xml:space="preserve">branch of the ten repositories updated that day, the eight automated suites were run: 655 tests, all passed and none skipped. This time the 7 payment persistence tests also ran, against the isolated</w:t>
+        <w:t xml:space="preserve">branch of the ten repositories updated that day, the team ran the eight automated suites again: 707 tests, all passed and none skipped, including the 7 payment persistence tests against the isolated</w:t>
       </w:r>
       <w:r>
         <w:t xml:space="preserve"> </w:t>
@@ -2284,31 +2422,22 @@
         <w:t xml:space="preserve"> </w:t>
       </w:r>
       <w:r>
-        <w:t xml:space="preserve">database. When the role change was reverted on October 20, 2 tests left security-service (</w:t>
+        <w:t xml:space="preserve">database. It is the final run of the day and includes the change to bookings that ended and nobody closed, made after the team review, and the fix for</w:t>
+      </w:r>
+      <w:r>
+        <w:t xml:space="preserve"> </w:t>
       </w:r>
       <w:r>
         <w:rPr>
           <w:rStyle w:val="VerbatimChar"/>
         </w:rPr>
-        <w:t xml:space="preserve">changingTheRoleReplacesItAndClosesTheSessions</w:t>
+        <w:t xml:space="preserve">null</w:t>
       </w:r>
       <w:r>
         <w:t xml:space="preserve"> </w:t>
       </w:r>
       <w:r>
-        <w:t xml:space="preserve">and</w:t>
-      </w:r>
-      <w:r>
-        <w:t xml:space="preserve"> </w:t>
-      </w:r>
-      <w:r>
-        <w:rPr>
-          <w:rStyle w:val="VerbatimChar"/>
-        </w:rPr>
-        <w:t xml:space="preserve">nobodyChangesTheirOwnRole</w:t>
-      </w:r>
-      <w:r>
-        <w:t xml:space="preserve">), so that suite now has 2 tests fewer than the 151 in Table 5; Table 5 keeps the real numbers of the October 19 run.</w:t>
+        <w:t xml:space="preserve">fields in notification-service events. Table 5 shows each suite and what changed from the early-morning run.</w:t>
       </w:r>
     </w:p>
     <w:p>
@@ -2332,7 +2461,7 @@
           <w:i/>
           <w:iCs/>
         </w:rPr>
-        <w:t xml:space="preserve">Actual results per artifact (October 19, 2026)</w:t>
+        <w:t xml:space="preserve">Actual results per artifact (October 21, 2026, evening run)</w:t>
       </w:r>
     </w:p>
     <w:tbl>
@@ -2427,7 +2556,7 @@
               <w:pStyle w:val="Compact"/>
             </w:pPr>
             <w:r>
-              <w:t xml:space="preserve">Duration</w:t>
+              <w:t xml:space="preserve">Compared with the early-morning run of October 21 (689)</w:t>
             </w:r>
           </w:p>
         </w:tc>
@@ -2465,18 +2594,18 @@
               <w:pStyle w:val="Compact"/>
             </w:pPr>
             <w:r>
-              <w:t xml:space="preserve">43</w:t>
-            </w:r>
-          </w:p>
-        </w:tc>
-        <w:tc>
-          <w:tcPr/>
-          <w:p>
-            <w:pPr>
-              <w:pStyle w:val="Compact"/>
-            </w:pPr>
-            <w:r>
-              <w:t xml:space="preserve">43</w:t>
+              <w:t xml:space="preserve">62</w:t>
+            </w:r>
+          </w:p>
+        </w:tc>
+        <w:tc>
+          <w:tcPr/>
+          <w:p>
+            <w:pPr>
+              <w:pStyle w:val="Compact"/>
+            </w:pPr>
+            <w:r>
+              <w:t xml:space="preserve">62</w:t>
             </w:r>
           </w:p>
         </w:tc>
@@ -2509,7 +2638,16 @@
               <w:pStyle w:val="Compact"/>
             </w:pPr>
             <w:r>
-              <w:t xml:space="preserve">6.7 s</w:t>
+              <w:t xml:space="preserve">+2: "To close" list in the bookings store (</w:t>
+            </w:r>
+            <w:r>
+              <w:rPr>
+                <w:rStyle w:val="VerbatimChar"/>
+              </w:rPr>
+              <w:t xml:space="preserve">reservations-store.spec.ts</w:t>
+            </w:r>
+            <w:r>
+              <w:t xml:space="preserve">)</w:t>
             </w:r>
           </w:p>
         </w:tc>
@@ -2547,18 +2685,18 @@
               <w:pStyle w:val="Compact"/>
             </w:pPr>
             <w:r>
-              <w:t xml:space="preserve">34</w:t>
-            </w:r>
-          </w:p>
-        </w:tc>
-        <w:tc>
-          <w:tcPr/>
-          <w:p>
-            <w:pPr>
-              <w:pStyle w:val="Compact"/>
-            </w:pPr>
-            <w:r>
-              <w:t xml:space="preserve">34</w:t>
+              <w:t xml:space="preserve">40</w:t>
+            </w:r>
+          </w:p>
+        </w:tc>
+        <w:tc>
+          <w:tcPr/>
+          <w:p>
+            <w:pPr>
+              <w:pStyle w:val="Compact"/>
+            </w:pPr>
+            <w:r>
+              <w:t xml:space="preserve">40</w:t>
             </w:r>
           </w:p>
         </w:tc>
@@ -2591,7 +2729,7 @@
               <w:pStyle w:val="Compact"/>
             </w:pPr>
             <w:r>
-              <w:t xml:space="preserve">12.2 s</w:t>
+              <w:t xml:space="preserve">No change</w:t>
             </w:r>
           </w:p>
         </w:tc>
@@ -2629,18 +2767,18 @@
               <w:pStyle w:val="Compact"/>
             </w:pPr>
             <w:r>
-              <w:t xml:space="preserve">151</w:t>
-            </w:r>
-          </w:p>
-        </w:tc>
-        <w:tc>
-          <w:tcPr/>
-          <w:p>
-            <w:pPr>
-              <w:pStyle w:val="Compact"/>
-            </w:pPr>
-            <w:r>
-              <w:t xml:space="preserve">151</w:t>
+              <w:t xml:space="preserve">155</w:t>
+            </w:r>
+          </w:p>
+        </w:tc>
+        <w:tc>
+          <w:tcPr/>
+          <w:p>
+            <w:pPr>
+              <w:pStyle w:val="Compact"/>
+            </w:pPr>
+            <w:r>
+              <w:t xml:space="preserve">155</w:t>
             </w:r>
           </w:p>
         </w:tc>
@@ -2673,7 +2811,7 @@
               <w:pStyle w:val="Compact"/>
             </w:pPr>
             <w:r>
-              <w:t xml:space="preserve">9.7 s</w:t>
+              <w:t xml:space="preserve">No change</w:t>
             </w:r>
           </w:p>
         </w:tc>
@@ -2755,7 +2893,7 @@
               <w:pStyle w:val="Compact"/>
             </w:pPr>
             <w:r>
-              <w:t xml:space="preserve">7.4 s</w:t>
+              <w:t xml:space="preserve">No change</w:t>
             </w:r>
           </w:p>
         </w:tc>
@@ -2793,18 +2931,18 @@
               <w:pStyle w:val="Compact"/>
             </w:pPr>
             <w:r>
-              <w:t xml:space="preserve">43</w:t>
-            </w:r>
-          </w:p>
-        </w:tc>
-        <w:tc>
-          <w:tcPr/>
-          <w:p>
-            <w:pPr>
-              <w:pStyle w:val="Compact"/>
-            </w:pPr>
-            <w:r>
-              <w:t xml:space="preserve">43</w:t>
+              <w:t xml:space="preserve">50</w:t>
+            </w:r>
+          </w:p>
+        </w:tc>
+        <w:tc>
+          <w:tcPr/>
+          <w:p>
+            <w:pPr>
+              <w:pStyle w:val="Compact"/>
+            </w:pPr>
+            <w:r>
+              <w:t xml:space="preserve">50</w:t>
             </w:r>
           </w:p>
         </w:tc>
@@ -2837,7 +2975,40 @@
               <w:pStyle w:val="Compact"/>
             </w:pPr>
             <w:r>
-              <w:t xml:space="preserve">6.8 s</w:t>
+              <w:t xml:space="preserve">+3: only a scheduled booking expires by itself, and a confirmed one becomes No-show only when operations asks for it through the internal route and it has already expired (</w:t>
+            </w:r>
+            <w:r>
+              <w:rPr>
+                <w:rStyle w:val="VerbatimChar"/>
+              </w:rPr>
+              <w:t xml:space="preserve">BookingTest</w:t>
+            </w:r>
+            <w:r>
+              <w:t xml:space="preserve">,</w:t>
+            </w:r>
+            <w:r>
+              <w:t xml:space="preserve"> </w:t>
+            </w:r>
+            <w:r>
+              <w:rPr>
+                <w:rStyle w:val="VerbatimChar"/>
+              </w:rPr>
+              <w:t xml:space="preserve">BookingServiceTest</w:t>
+            </w:r>
+            <w:r>
+              <w:t xml:space="preserve">,</w:t>
+            </w:r>
+            <w:r>
+              <w:t xml:space="preserve"> </w:t>
+            </w:r>
+            <w:r>
+              <w:rPr>
+                <w:rStyle w:val="VerbatimChar"/>
+              </w:rPr>
+              <w:t xml:space="preserve">BookingApiWebTest</w:t>
+            </w:r>
+            <w:r>
+              <w:t xml:space="preserve">)</w:t>
             </w:r>
           </w:p>
         </w:tc>
@@ -2875,18 +3046,18 @@
               <w:pStyle w:val="Compact"/>
             </w:pPr>
             <w:r>
-              <w:t xml:space="preserve">55</w:t>
-            </w:r>
-          </w:p>
-        </w:tc>
-        <w:tc>
-          <w:tcPr/>
-          <w:p>
-            <w:pPr>
-              <w:pStyle w:val="Compact"/>
-            </w:pPr>
-            <w:r>
-              <w:t xml:space="preserve">55</w:t>
+              <w:t xml:space="preserve">67</w:t>
+            </w:r>
+          </w:p>
+        </w:tc>
+        <w:tc>
+          <w:tcPr/>
+          <w:p>
+            <w:pPr>
+              <w:pStyle w:val="Compact"/>
+            </w:pPr>
+            <w:r>
+              <w:t xml:space="preserve">67</w:t>
             </w:r>
           </w:p>
         </w:tc>
@@ -2919,7 +3090,49 @@
               <w:pStyle w:val="Compact"/>
             </w:pPr>
             <w:r>
-              <w:t xml:space="preserve">7.6 s</w:t>
+              <w:t xml:space="preserve">+11: what to do with a booking that ended and nobody closed (</w:t>
+            </w:r>
+            <w:r>
+              <w:rPr>
+                <w:rStyle w:val="VerbatimChar"/>
+              </w:rPr>
+              <w:t xml:space="preserve">FollowUpPolicyTest</w:t>
+            </w:r>
+            <w:r>
+              <w:t xml:space="preserve">), closing the ones that never had an operator, a single notice, the "To close" list, and closing as "Attended" without made-up times (</w:t>
+            </w:r>
+            <w:r>
+              <w:rPr>
+                <w:rStyle w:val="VerbatimChar"/>
+              </w:rPr>
+              <w:t xml:space="preserve">FollowUpServiceTest</w:t>
+            </w:r>
+            <w:r>
+              <w:t xml:space="preserve">,</w:t>
+            </w:r>
+            <w:r>
+              <w:t xml:space="preserve"> </w:t>
+            </w:r>
+            <w:r>
+              <w:rPr>
+                <w:rStyle w:val="VerbatimChar"/>
+              </w:rPr>
+              <w:t xml:space="preserve">ServiceExecutionTest</w:t>
+            </w:r>
+            <w:r>
+              <w:t xml:space="preserve">,</w:t>
+            </w:r>
+            <w:r>
+              <w:t xml:space="preserve"> </w:t>
+            </w:r>
+            <w:r>
+              <w:rPr>
+                <w:rStyle w:val="VerbatimChar"/>
+              </w:rPr>
+              <w:t xml:space="preserve">OperationsApiWebTest</w:t>
+            </w:r>
+            <w:r>
+              <w:t xml:space="preserve">)</w:t>
             </w:r>
           </w:p>
         </w:tc>
@@ -2957,18 +3170,18 @@
               <w:pStyle w:val="Compact"/>
             </w:pPr>
             <w:r>
-              <w:t xml:space="preserve">112</w:t>
-            </w:r>
-          </w:p>
-        </w:tc>
-        <w:tc>
-          <w:tcPr/>
-          <w:p>
-            <w:pPr>
-              <w:pStyle w:val="Compact"/>
-            </w:pPr>
-            <w:r>
-              <w:t xml:space="preserve">112</w:t>
+              <w:t xml:space="preserve">114</w:t>
+            </w:r>
+          </w:p>
+        </w:tc>
+        <w:tc>
+          <w:tcPr/>
+          <w:p>
+            <w:pPr>
+              <w:pStyle w:val="Compact"/>
+            </w:pPr>
+            <w:r>
+              <w:t xml:space="preserve">114</w:t>
             </w:r>
           </w:p>
         </w:tc>
@@ -3001,7 +3214,40 @@
               <w:pStyle w:val="Compact"/>
             </w:pPr>
             <w:r>
-              <w:t xml:space="preserve">0.6 s</w:t>
+              <w:t xml:space="preserve">+2: notice to the operator and the administrator about an unregistered service (</w:t>
+            </w:r>
+            <w:r>
+              <w:rPr>
+                <w:rStyle w:val="VerbatimChar"/>
+              </w:rPr>
+              <w:t xml:space="preserve">StaffNotificationsTest</w:t>
+            </w:r>
+            <w:r>
+              <w:t xml:space="preserve">) and a</w:t>
+            </w:r>
+            <w:r>
+              <w:t xml:space="preserve"> </w:t>
+            </w:r>
+            <w:r>
+              <w:rPr>
+                <w:rStyle w:val="VerbatimChar"/>
+              </w:rPr>
+              <w:t xml:space="preserve">null</w:t>
+            </w:r>
+            <w:r>
+              <w:t xml:space="preserve"> </w:t>
+            </w:r>
+            <w:r>
+              <w:t xml:space="preserve">field in the event that no longer goes to the dead-letter queue (</w:t>
+            </w:r>
+            <w:r>
+              <w:rPr>
+                <w:rStyle w:val="VerbatimChar"/>
+              </w:rPr>
+              <w:t xml:space="preserve">DomainEventEnvelopeTest</w:t>
+            </w:r>
+            <w:r>
+              <w:t xml:space="preserve">)</w:t>
             </w:r>
           </w:p>
         </w:tc>
@@ -3039,18 +3285,18 @@
               <w:pStyle w:val="Compact"/>
             </w:pPr>
             <w:r>
-              <w:t xml:space="preserve">113</w:t>
-            </w:r>
-          </w:p>
-        </w:tc>
-        <w:tc>
-          <w:tcPr/>
-          <w:p>
-            <w:pPr>
-              <w:pStyle w:val="Compact"/>
-            </w:pPr>
-            <w:r>
-              <w:t xml:space="preserve">113</w:t>
+              <w:t xml:space="preserve">115</w:t>
+            </w:r>
+          </w:p>
+        </w:tc>
+        <w:tc>
+          <w:tcPr/>
+          <w:p>
+            <w:pPr>
+              <w:pStyle w:val="Compact"/>
+            </w:pPr>
+            <w:r>
+              <w:t xml:space="preserve">115</w:t>
             </w:r>
           </w:p>
         </w:tc>
@@ -3083,7 +3329,7 @@
               <w:pStyle w:val="Compact"/>
             </w:pPr>
             <w:r>
-              <w:t xml:space="preserve">0.3 s</w:t>
+              <w:t xml:space="preserve">No change</w:t>
             </w:r>
           </w:p>
         </w:tc>
@@ -3162,7 +3408,7 @@
               <w:pStyle w:val="Compact"/>
             </w:pPr>
             <w:r>
-              <w:t xml:space="preserve">0.4 s</w:t>
+              <w:t xml:space="preserve">No change</w:t>
             </w:r>
           </w:p>
         </w:tc>
@@ -3253,7 +3499,7 @@
               <w:pStyle w:val="Compact"/>
             </w:pPr>
             <w:r>
-              <w:t xml:space="preserve">2 s</w:t>
+              <w:t xml:space="preserve">No change</w:t>
             </w:r>
           </w:p>
         </w:tc>
@@ -3293,7 +3539,7 @@
                 <w:b/>
                 <w:bCs/>
               </w:rPr>
-              <w:t xml:space="preserve">655</w:t>
+              <w:t xml:space="preserve">707</w:t>
             </w:r>
           </w:p>
         </w:tc>
@@ -3308,7 +3554,7 @@
                 <w:b/>
                 <w:bCs/>
               </w:rPr>
-              <w:t xml:space="preserve">655</w:t>
+              <w:t xml:space="preserve">707</w:t>
             </w:r>
           </w:p>
         </w:tc>
@@ -3348,6 +3594,13 @@
             <w:pPr>
               <w:pStyle w:val="Compact"/>
             </w:pPr>
+            <w:r>
+              <w:rPr>
+                <w:b/>
+                <w:bCs/>
+              </w:rPr>
+              <w:t xml:space="preserve">+18</w:t>
+            </w:r>
           </w:p>
         </w:tc>
       </w:tr>
@@ -3367,7 +3620,31 @@
         <w:t xml:space="preserve"> </w:t>
       </w:r>
       <w:r>
-        <w:t xml:space="preserve">Sources: Vitest output, the</w:t>
+        <w:t xml:space="preserve">Sources: records of the team runs of October 21, 2026 (</w:t>
+      </w:r>
+      <w:r>
+        <w:rPr>
+          <w:rStyle w:val="VerbatimChar"/>
+        </w:rPr>
+        <w:t xml:space="preserve">vehicle-w-docs/11-quality/testing-strategy.md</w:t>
+      </w:r>
+      <w:r>
+        <w:t xml:space="preserve">), Vitest and</w:t>
+      </w:r>
+      <w:r>
+        <w:t xml:space="preserve"> </w:t>
+      </w:r>
+      <w:r>
+        <w:rPr>
+          <w:rStyle w:val="VerbatimChar"/>
+        </w:rPr>
+        <w:t xml:space="preserve">dotnet test</w:t>
+      </w:r>
+      <w:r>
+        <w:t xml:space="preserve"> </w:t>
+      </w:r>
+      <w:r>
+        <w:t xml:space="preserve">output, and the</w:t>
       </w:r>
       <w:r>
         <w:t xml:space="preserve"> </w:t>
@@ -3391,22 +3668,7 @@
         <w:t xml:space="preserve">Tests run:</w:t>
       </w:r>
       <w:r>
-        <w:t xml:space="preserve">) and the surefire reports of each Java service, and the</w:t>
-      </w:r>
-      <w:r>
-        <w:t xml:space="preserve"> </w:t>
-      </w:r>
-      <w:r>
-        <w:rPr>
-          <w:rStyle w:val="VerbatimChar"/>
-        </w:rPr>
-        <w:t xml:space="preserve">dotnet test</w:t>
-      </w:r>
-      <w:r>
-        <w:t xml:space="preserve"> </w:t>
-      </w:r>
-      <w:r>
-        <w:t xml:space="preserve">output. Maven durations add up the time of the test classes, without the build. More tests run than there are methods in Table 4 because parameterized tests (</w:t>
+        <w:t xml:space="preserve">) with the surefire reports. More tests run than there are methods in Table 4 because parameterized tests (</w:t>
       </w:r>
       <w:r>
         <w:rPr>
@@ -3442,12 +3704,36 @@
         <w:t xml:space="preserve"> </w:t>
       </w:r>
       <w:r>
-        <w:t xml:space="preserve">attribute of the surefire XML says 68 because of a nested test class; Maven runs and counts 69, which is the right number (the previous version of this document had taken 68).</w:t>
+        <w:t xml:space="preserve">attribute of the surefire XML says 68 because of a nested test class; Maven runs and counts 69, which is the right number.</w:t>
       </w:r>
     </w:p>
     <w:p>
       <w:pPr>
         <w:pStyle w:val="FirstParagraph"/>
+      </w:pPr>
+      <w:r>
+        <w:t xml:space="preserve">The early-morning run of October 21, 2026 had 689 tests, all passed: web 60, api-gateway 40, security-service 155, customer-service 69, booking-service 47, operations-service 56, notification-service 112, and payment-service 150 (115 domain, 28 application, and 7 persistence). Compared with October 19 it added 34: session across tabs, bookings without an operator and filters, accounts and fixed roles, reports, and loyalty bar in the web (+17); session check in the gateway (+6); sessions in security-service (+4, after removing 2 for the reverted role change); expired bookings in booking-service (+4); assignment lock in operations-service (+1); and the 2 MB receipt maximum in payment-service (+2). That same early morning, the suites that had changed were repeated separately, with the same result.</w:t>
+      </w:r>
+    </w:p>
+    <w:p>
+      <w:pPr>
+        <w:pStyle w:val="BodyText"/>
+      </w:pPr>
+      <w:r>
+        <w:t xml:space="preserve">The run of October 19, 2026 had 655 tests, all passed: web 43, api-gateway 34, security-service 151, customer-service 69, booking-service 43, operations-service 55, notification-service 112, and payment-service 148 (113 domain, 28 application, and 7 persistence). Figures 1 to 3 are from that run.</w:t>
+      </w:r>
+    </w:p>
+    <w:p>
+      <w:pPr>
+        <w:pStyle w:val="BodyText"/>
+      </w:pPr>
+      <w:r>
+        <w:t xml:space="preserve">Besides the automated tests, the "To close" list was checked live on October 21, 2026: a booking without an operator became No-show by itself; one with an operator that was never started and one started but never finished were left to close, with one notice to the operator and another to the administrator that was not repeated; closing them as "Attended" left them completed without made-up times, and closing them again answered 409. It looked the same on the web and in the mobile app (390 px).</w:t>
+      </w:r>
+    </w:p>
+    <w:p>
+      <w:pPr>
+        <w:pStyle w:val="BodyText"/>
       </w:pPr>
       <w:r>
         <w:rPr>
@@ -3537,7 +3823,7 @@
           <w:i/>
           <w:iCs/>
         </w:rPr>
-        <w:t xml:space="preserve">Result of the payment-service tests, including the persistence ones</w:t>
+        <w:t xml:space="preserve">Result of the payment-service tests, including the persistence ones (October 19, 2026)</w:t>
       </w:r>
     </w:p>
     <w:p>
@@ -3608,7 +3894,7 @@
           <w:i/>
           <w:iCs/>
         </w:rPr>
-        <w:t xml:space="preserve">Web tests and production build, and TypeScript build of the mobile app</w:t>
+        <w:t xml:space="preserve">Web tests and production build, and TypeScript build of the mobile app (October 19, 2026)</w:t>
       </w:r>
     </w:p>
     <w:p>
@@ -3753,7 +4039,7 @@
         </w:numPr>
       </w:pPr>
       <w:r>
-        <w:t xml:space="preserve">The run used JDK 25 and .NET SDK 9 on projects for Java 21 and .NET 8. GitHub Actions runs the same tests with Temurin 21 and .NET 8 on every change (Deployment Document).</w:t>
+        <w:t xml:space="preserve">The October 19 run used JDK 25 and .NET SDK 9 on projects for Java 21 and .NET 8. GitHub Actions runs the same tests with Temurin 21 and .NET 8 on every change (Deployment Document).</w:t>
       </w:r>
     </w:p>
     <w:bookmarkStart w:id="39" w:name="X1e87cdfcc1cbf65d259e528f643bdb7dd800108"/>
@@ -3812,7 +4098,7 @@
         <w:t xml:space="preserve"> </w:t>
       </w:r>
       <w:r>
-        <w:t xml:space="preserve">(the test operator of the local database). The 19 tests passed in 11.2 s. Each test deletes what it creates and leaves the customer's points as they were.</w:t>
+        <w:t xml:space="preserve">(the test operator of the local database). The 19 tests passed in 11.2 s. Each test deletes what it creates and leaves the customer's points as they were. On October 21, 2026, the team ran them again, early in the morning and in the evening, with the gateway session check on, and all 19 passed both times; the files in Table 5a have not changed since October 18.</w:t>
       </w:r>
     </w:p>
     <w:p>
@@ -5206,7 +5492,7 @@
         <w:pStyle w:val="FirstParagraph"/>
       </w:pPr>
       <w:r>
-        <w:t xml:space="preserve">Cases CP-01 to CP-33 were defined on SRS v4 and first run on October 9, 2026; cases CP-34 to CP-42 cover the requirements implemented afterwards (RF-004b, RF-008, RF-010, RF-015, RF-022, RF-036, RF-037, and RF-038) and the administrator accounts of RF-028. All 42 were run on October 19, 2026, against the full system through the API Gateway (the same calls the web and mobile clients make), with a script that creates its own accounts and data and deletes them at the end. All 42 passed (Figure 7).</w:t>
+        <w:t xml:space="preserve">Cases CP-01 to CP-33 were defined on SRS v4 and first run on October 9, 2026; cases CP-34 to CP-42 cover the requirements implemented afterwards (RF-004b, RF-008, RF-010, RF-015, RF-022, RF-036, RF-037, and RF-038) and the administrator accounts of RF-028. All 42 were run on October 19, 2026, against the full system through the API Gateway (the same calls the web and mobile clients make), with a script that creates its own accounts and data and deletes them at the end. All 42 passed (Figure 7). The changes of October 21, 2026 (the token of a closed session, the close of expired bookings, and the receipt of at most 2 MB) do not have a functional case of their own yet; the automated tests in Table 5 cover them (gap 7 in Table 8).</w:t>
       </w:r>
     </w:p>
     <w:p>
@@ -10109,7 +10395,7 @@
         <w:pStyle w:val="FirstParagraph"/>
       </w:pPr>
       <w:r>
-        <w:t xml:space="preserve">Of the 41 requirements in SRS v7.6, 38 have a functional case and 39 a related automated test; RF-032 and RF-034 only have a functional case, and RF-017, RF-023, and RF-025 only an automated test.</w:t>
+        <w:t xml:space="preserve">Of the 41 requirements in SRS v7.7, 38 have a functional case and 39 a related automated test; RF-032 and RF-034 only have a functional case, and RF-017, RF-023, and RF-025 only an automated test.</w:t>
       </w:r>
     </w:p>
     <w:p>
@@ -10839,6 +11125,24 @@
               </w:rPr>
               <w:t xml:space="preserve">POST /users/me/deactivate</w:t>
             </w:r>
+            <w:r>
+              <w:t xml:space="preserve">,</w:t>
+            </w:r>
+            <w:r>
+              <w:t xml:space="preserve"> </w:t>
+            </w:r>
+            <w:r>
+              <w:rPr>
+                <w:rStyle w:val="VerbatimChar"/>
+              </w:rPr>
+              <w:t xml:space="preserve">GET /auth/session</w:t>
+            </w:r>
+            <w:r>
+              <w:t xml:space="preserve"> </w:t>
+            </w:r>
+            <w:r>
+              <w:t xml:space="preserve">(gateway)</w:t>
+            </w:r>
           </w:p>
         </w:tc>
         <w:tc>
@@ -10901,6 +11205,54 @@
                 <w:rStyle w:val="VerbatimChar"/>
               </w:rPr>
               <w:t xml:space="preserve">AuthenticationServiceTest</w:t>
+            </w:r>
+            <w:r>
+              <w:t xml:space="preserve">,</w:t>
+            </w:r>
+            <w:r>
+              <w:t xml:space="preserve"> </w:t>
+            </w:r>
+            <w:r>
+              <w:rPr>
+                <w:rStyle w:val="VerbatimChar"/>
+              </w:rPr>
+              <w:t xml:space="preserve">ApiSecurityWebTest</w:t>
+            </w:r>
+            <w:r>
+              <w:t xml:space="preserve"> </w:t>
+            </w:r>
+            <w:r>
+              <w:t xml:space="preserve">and</w:t>
+            </w:r>
+            <w:r>
+              <w:t xml:space="preserve"> </w:t>
+            </w:r>
+            <w:r>
+              <w:rPr>
+                <w:rStyle w:val="VerbatimChar"/>
+              </w:rPr>
+              <w:t xml:space="preserve">SessionCheckFilterTest</w:t>
+            </w:r>
+            <w:r>
+              <w:t xml:space="preserve"> </w:t>
+            </w:r>
+            <w:r>
+              <w:t xml:space="preserve">(token of a closed session),</w:t>
+            </w:r>
+            <w:r>
+              <w:t xml:space="preserve"> </w:t>
+            </w:r>
+            <w:r>
+              <w:rPr>
+                <w:rStyle w:val="VerbatimChar"/>
+              </w:rPr>
+              <w:t xml:space="preserve">auth.spec.ts</w:t>
+            </w:r>
+            <w:r>
+              <w:t xml:space="preserve"> </w:t>
+            </w:r>
+            <w:r>
+              <w:t xml:space="preserve">(tabs)</w:t>
             </w:r>
           </w:p>
         </w:tc>
@@ -11104,6 +11456,24 @@
               </w:rPr>
               <w:t xml:space="preserve">RolePermissionAdministrationServiceTest</w:t>
             </w:r>
+            <w:r>
+              <w:t xml:space="preserve">,</w:t>
+            </w:r>
+            <w:r>
+              <w:t xml:space="preserve"> </w:t>
+            </w:r>
+            <w:r>
+              <w:rPr>
+                <w:rStyle w:val="VerbatimChar"/>
+              </w:rPr>
+              <w:t xml:space="preserve">management.spec.ts</w:t>
+            </w:r>
+            <w:r>
+              <w:t xml:space="preserve"> </w:t>
+            </w:r>
+            <w:r>
+              <w:t xml:space="preserve">(fixed roles)</w:t>
+            </w:r>
           </w:p>
         </w:tc>
       </w:tr>
@@ -11911,6 +12281,30 @@
               </w:rPr>
               <w:t xml:space="preserve">PATCH /admin/bookings/{id}/status</w:t>
             </w:r>
+            <w:r>
+              <w:t xml:space="preserve">,</w:t>
+            </w:r>
+            <w:r>
+              <w:t xml:space="preserve"> </w:t>
+            </w:r>
+            <w:r>
+              <w:rPr>
+                <w:rStyle w:val="VerbatimChar"/>
+              </w:rPr>
+              <w:t xml:space="preserve">GET /admin/assignments/to-close</w:t>
+            </w:r>
+            <w:r>
+              <w:t xml:space="preserve">,</w:t>
+            </w:r>
+            <w:r>
+              <w:t xml:space="preserve"> </w:t>
+            </w:r>
+            <w:r>
+              <w:rPr>
+                <w:rStyle w:val="VerbatimChar"/>
+              </w:rPr>
+              <w:t xml:space="preserve">POST /admin/assignments/{bookingId}/attended</w:t>
+            </w:r>
           </w:p>
         </w:tc>
         <w:tc>
@@ -11925,6 +12319,24 @@
               </w:rPr>
               <w:t xml:space="preserve">/admin/reservations</w:t>
             </w:r>
+            <w:r>
+              <w:t xml:space="preserve">,</w:t>
+            </w:r>
+            <w:r>
+              <w:t xml:space="preserve"> </w:t>
+            </w:r>
+            <w:r>
+              <w:rPr>
+                <w:rStyle w:val="VerbatimChar"/>
+              </w:rPr>
+              <w:t xml:space="preserve">/admin</w:t>
+            </w:r>
+            <w:r>
+              <w:t xml:space="preserve"> </w:t>
+            </w:r>
+            <w:r>
+              <w:t xml:space="preserve">("To close")</w:t>
+            </w:r>
           </w:p>
         </w:tc>
         <w:tc>
@@ -11961,6 +12373,57 @@
                 <w:rStyle w:val="VerbatimChar"/>
               </w:rPr>
               <w:t xml:space="preserve">BookingServiceTest</w:t>
+            </w:r>
+            <w:r>
+              <w:t xml:space="preserve"> </w:t>
+            </w:r>
+            <w:r>
+              <w:t xml:space="preserve">(including the cancellation of expired scheduled bookings and the internal no-show route),</w:t>
+            </w:r>
+            <w:r>
+              <w:t xml:space="preserve"> </w:t>
+            </w:r>
+            <w:r>
+              <w:rPr>
+                <w:rStyle w:val="VerbatimChar"/>
+              </w:rPr>
+              <w:t xml:space="preserve">BookingApiWebTest</w:t>
+            </w:r>
+            <w:r>
+              <w:t xml:space="preserve">,</w:t>
+            </w:r>
+            <w:r>
+              <w:t xml:space="preserve"> </w:t>
+            </w:r>
+            <w:r>
+              <w:rPr>
+                <w:rStyle w:val="VerbatimChar"/>
+              </w:rPr>
+              <w:t xml:space="preserve">FollowUpPolicyTest</w:t>
+            </w:r>
+            <w:r>
+              <w:t xml:space="preserve">,</w:t>
+            </w:r>
+            <w:r>
+              <w:t xml:space="preserve"> </w:t>
+            </w:r>
+            <w:r>
+              <w:rPr>
+                <w:rStyle w:val="VerbatimChar"/>
+              </w:rPr>
+              <w:t xml:space="preserve">FollowUpServiceTest</w:t>
+            </w:r>
+            <w:r>
+              <w:t xml:space="preserve">,</w:t>
+            </w:r>
+            <w:r>
+              <w:t xml:space="preserve"> </w:t>
+            </w:r>
+            <w:r>
+              <w:rPr>
+                <w:rStyle w:val="VerbatimChar"/>
+              </w:rPr>
+              <w:t xml:space="preserve">reservations-store.spec.ts</w:t>
             </w:r>
           </w:p>
         </w:tc>
@@ -12182,6 +12645,21 @@
               </w:rPr>
               <w:t xml:space="preserve">OperationsServiceTest</w:t>
             </w:r>
+            <w:r>
+              <w:t xml:space="preserve"> </w:t>
+            </w:r>
+            <w:r>
+              <w:t xml:space="preserve">(assignment lock and rule for bookings without an operator),</w:t>
+            </w:r>
+            <w:r>
+              <w:t xml:space="preserve"> </w:t>
+            </w:r>
+            <w:r>
+              <w:rPr>
+                <w:rStyle w:val="VerbatimChar"/>
+              </w:rPr>
+              <w:t xml:space="preserve">reservations-store.spec.ts</w:t>
+            </w:r>
           </w:p>
         </w:tc>
       </w:tr>
@@ -13124,7 +13602,10 @@
               <w:t xml:space="preserve">PaymentTests</w:t>
             </w:r>
             <w:r>
-              <w:t xml:space="preserve">,</w:t>
+              <w:t xml:space="preserve"> </w:t>
+            </w:r>
+            <w:r>
+              <w:t xml:space="preserve">(receipt of at most 2 MB),</w:t>
             </w:r>
             <w:r>
               <w:t xml:space="preserve"> </w:t>
@@ -14061,6 +14542,24 @@
                 <w:rStyle w:val="VerbatimChar"/>
               </w:rPr>
               <w:t xml:space="preserve">TeamSummaryCalculatorTest</w:t>
+            </w:r>
+            <w:r>
+              <w:t xml:space="preserve">,</w:t>
+            </w:r>
+            <w:r>
+              <w:t xml:space="preserve"> </w:t>
+            </w:r>
+            <w:r>
+              <w:rPr>
+                <w:rStyle w:val="VerbatimChar"/>
+              </w:rPr>
+              <w:t xml:space="preserve">reports.spec.ts</w:t>
+            </w:r>
+            <w:r>
+              <w:t xml:space="preserve"> </w:t>
+            </w:r>
+            <w:r>
+              <w:t xml:space="preserve">(only completed bookings count)</w:t>
             </w:r>
           </w:p>
         </w:tc>
@@ -14512,7 +15011,7 @@
               <w:pStyle w:val="Compact"/>
             </w:pPr>
             <w:r>
-              <w:t xml:space="preserve">Most of the 43 web tests only check that the component is created</w:t>
+              <w:t xml:space="preserve">Many of the 62 web tests only check that the component is created; the 19 added on October 21, 2026 already test real rules (session across tabs, bookings without an operator, "To close", fixed roles, and reports)</w:t>
             </w:r>
           </w:p>
         </w:tc>
@@ -14577,7 +15076,7 @@
               <w:pStyle w:val="Compact"/>
             </w:pPr>
             <w:r>
-              <w:t xml:space="preserve">The 7 payment persistence tests need a migrated database and skip without it; on October 19 they were run against</w:t>
+              <w:t xml:space="preserve">The 7 payment persistence tests need a migrated database and skip without it; on October 19 and 21 they were run against</w:t>
             </w:r>
             <w:r>
               <w:t xml:space="preserve"> </w:t>
@@ -14639,7 +15138,16 @@
               <w:pStyle w:val="Compact"/>
             </w:pPr>
             <w:r>
-              <w:t xml:space="preserve">For RF-023 (reports) only the operator metrics and the team summary are tested; the PDF/Excel export has no test</w:t>
+              <w:t xml:space="preserve">For RF-023 (reports) the operator metrics, the team summary and, since October 21, 2026, that only completed bookings count (</w:t>
+            </w:r>
+            <w:r>
+              <w:rPr>
+                <w:rStyle w:val="VerbatimChar"/>
+              </w:rPr>
+              <w:t xml:space="preserve">reports.spec.ts</w:t>
+            </w:r>
+            <w:r>
+              <w:t xml:space="preserve">) are tested; the PDF/Excel export has no test</w:t>
             </w:r>
           </w:p>
         </w:tc>
@@ -14751,6 +15259,56 @@
             </w:pPr>
             <w:r>
               <w:t xml:space="preserve">Closed on October 19, 2026, with cases CP-34 to CP-41</w:t>
+            </w:r>
+          </w:p>
+        </w:tc>
+      </w:tr>
+      <w:tr>
+        <w:tc>
+          <w:tcPr/>
+          <w:p>
+            <w:pPr>
+              <w:pStyle w:val="Compact"/>
+            </w:pPr>
+            <w:r>
+              <w:t xml:space="preserve">7</w:t>
+            </w:r>
+          </w:p>
+        </w:tc>
+        <w:tc>
+          <w:tcPr/>
+          <w:p>
+            <w:pPr>
+              <w:pStyle w:val="Compact"/>
+            </w:pPr>
+            <w:r>
+              <w:t xml:space="preserve">The changes of October 21, 2026 (the token of a closed session stops working, bookings that ended and nobody closed with the "To close" list, the receipt over 2 MB, and the cash option that only appears with its account active) have no functional case of their own; automated tests cover them, except the cash option, the 19 end-to-end tests were run with the session check on, and "To close" was checked live on the web and in the mobile app</w:t>
+            </w:r>
+          </w:p>
+        </w:tc>
+        <w:tc>
+          <w:tcPr/>
+          <w:p>
+            <w:pPr>
+              <w:pStyle w:val="Compact"/>
+            </w:pPr>
+            <w:r>
+              <w:t xml:space="preserve">Add those functional cases and run them against the complete system; add a</w:t>
+            </w:r>
+            <w:r>
+              <w:t xml:space="preserve"> </w:t>
+            </w:r>
+            <w:r>
+              <w:rPr>
+                <w:rStyle w:val="VerbatimChar"/>
+              </w:rPr>
+              <w:t xml:space="preserve">PaymentAccountService</w:t>
+            </w:r>
+            <w:r>
+              <w:t xml:space="preserve"> </w:t>
+            </w:r>
+            <w:r>
+              <w:t xml:space="preserve">test for the cash account</w:t>
             </w:r>
           </w:p>
         </w:tc>
@@ -15382,6 +15940,152 @@
           </w:p>
         </w:tc>
       </w:tr>
+      <w:tr>
+        <w:tc>
+          <w:tcPr/>
+          <w:p>
+            <w:pPr>
+              <w:pStyle w:val="Compact"/>
+            </w:pPr>
+            <w:r>
+              <w:t xml:space="preserve">11</w:t>
+            </w:r>
+          </w:p>
+        </w:tc>
+        <w:tc>
+          <w:tcPr/>
+          <w:p>
+            <w:pPr>
+              <w:pStyle w:val="Compact"/>
+            </w:pPr>
+            <w:r>
+              <w:t xml:space="preserve">The first version of the automatic close (October 21) set to No-show every confirmed booking nobody started one hour after its end; if the operator washed the car and forgot to press "Start", the history, reports, and metrics recorded that the customer did not come, and No-show is final</w:t>
+            </w:r>
+          </w:p>
+        </w:tc>
+        <w:tc>
+          <w:tcPr/>
+          <w:p>
+            <w:pPr>
+              <w:pStyle w:val="Compact"/>
+            </w:pPr>
+            <w:r>
+              <w:t xml:space="preserve">Team review of October 21, 2026;</w:t>
+            </w:r>
+            <w:r>
+              <w:t xml:space="preserve"> </w:t>
+            </w:r>
+            <w:r>
+              <w:rPr>
+                <w:rStyle w:val="VerbatimChar"/>
+              </w:rPr>
+              <w:t xml:space="preserve">ExpiredBookingsJob</w:t>
+            </w:r>
+            <w:r>
+              <w:t xml:space="preserve"> </w:t>
+            </w:r>
+            <w:r>
+              <w:t xml:space="preserve">and</w:t>
+            </w:r>
+            <w:r>
+              <w:t xml:space="preserve"> </w:t>
+            </w:r>
+            <w:r>
+              <w:rPr>
+                <w:rStyle w:val="VerbatimChar"/>
+              </w:rPr>
+              <w:t xml:space="preserve">Booking.expire</w:t>
+            </w:r>
+            <w:r>
+              <w:t xml:space="preserve"> </w:t>
+            </w:r>
+            <w:r>
+              <w:t xml:space="preserve">in booking-service</w:t>
+            </w:r>
+          </w:p>
+        </w:tc>
+        <w:tc>
+          <w:tcPr/>
+          <w:p>
+            <w:pPr>
+              <w:pStyle w:val="Compact"/>
+            </w:pPr>
+            <w:r>
+              <w:t xml:space="preserve">High</w:t>
+            </w:r>
+          </w:p>
+        </w:tc>
+      </w:tr>
+      <w:tr>
+        <w:tc>
+          <w:tcPr/>
+          <w:p>
+            <w:pPr>
+              <w:pStyle w:val="Compact"/>
+            </w:pPr>
+            <w:r>
+              <w:t xml:space="preserve">12</w:t>
+            </w:r>
+          </w:p>
+        </w:tc>
+        <w:tc>
+          <w:tcPr/>
+          <w:p>
+            <w:pPr>
+              <w:pStyle w:val="Compact"/>
+            </w:pPr>
+            <w:r>
+              <w:t xml:space="preserve">A</w:t>
+            </w:r>
+            <w:r>
+              <w:t xml:space="preserve"> </w:t>
+            </w:r>
+            <w:r>
+              <w:rPr>
+                <w:rStyle w:val="VerbatimChar"/>
+              </w:rPr>
+              <w:t xml:space="preserve">null</w:t>
+            </w:r>
+            <w:r>
+              <w:t xml:space="preserve"> </w:t>
+            </w:r>
+            <w:r>
+              <w:t xml:space="preserve">field in an event payload sent the whole message to notification-service's dead-letter queue (DLQ), and the notice was not created</w:t>
+            </w:r>
+          </w:p>
+        </w:tc>
+        <w:tc>
+          <w:tcPr/>
+          <w:p>
+            <w:pPr>
+              <w:pStyle w:val="Compact"/>
+            </w:pPr>
+            <w:r>
+              <w:rPr>
+                <w:rStyle w:val="VerbatimChar"/>
+              </w:rPr>
+              <w:t xml:space="preserve">DomainEventEnvelope.java</w:t>
+            </w:r>
+            <w:r>
+              <w:t xml:space="preserve"> </w:t>
+            </w:r>
+            <w:r>
+              <w:t xml:space="preserve">in notification-service</w:t>
+            </w:r>
+          </w:p>
+        </w:tc>
+        <w:tc>
+          <w:tcPr/>
+          <w:p>
+            <w:pPr>
+              <w:pStyle w:val="Compact"/>
+            </w:pPr>
+            <w:r>
+              <w:t xml:space="preserve">Medium</w:t>
+            </w:r>
+          </w:p>
+        </w:tc>
+      </w:tr>
     </w:tbl>
     <w:p>
       <w:pPr>
@@ -15414,7 +16118,58 @@
         <w:t xml:space="preserve"> </w:t>
       </w:r>
       <w:r>
-        <w:t xml:space="preserve">branch of the web and the app; 8 and 9 were measured again with no overflow (Table 5c).</w:t>
+        <w:t xml:space="preserve">branch of the web and the app; 8 and 9 were measured again with no overflow (Table 5c). Defects 11 and 12 were fixed on the evening of October 21, 2026: the system now only cancels a scheduled booking that expired without confirmation and sets to No-show a confirmed one that never had an operator; one that had an operator goes to "To close" so the administrator decides (11,</w:t>
+      </w:r>
+      <w:r>
+        <w:t xml:space="preserve"> </w:t>
+      </w:r>
+      <w:r>
+        <w:rPr>
+          <w:rStyle w:val="VerbatimChar"/>
+        </w:rPr>
+        <w:t xml:space="preserve">FollowUpPolicyTest</w:t>
+      </w:r>
+      <w:r>
+        <w:t xml:space="preserve">,</w:t>
+      </w:r>
+      <w:r>
+        <w:t xml:space="preserve"> </w:t>
+      </w:r>
+      <w:r>
+        <w:rPr>
+          <w:rStyle w:val="VerbatimChar"/>
+        </w:rPr>
+        <w:t xml:space="preserve">FollowUpServiceTest</w:t>
+      </w:r>
+      <w:r>
+        <w:t xml:space="preserve">); and the</w:t>
+      </w:r>
+      <w:r>
+        <w:t xml:space="preserve"> </w:t>
+      </w:r>
+      <w:r>
+        <w:rPr>
+          <w:rStyle w:val="VerbatimChar"/>
+        </w:rPr>
+        <w:t xml:space="preserve">null</w:t>
+      </w:r>
+      <w:r>
+        <w:t xml:space="preserve"> </w:t>
+      </w:r>
+      <w:r>
+        <w:t xml:space="preserve">field is ignored (12,</w:t>
+      </w:r>
+      <w:r>
+        <w:t xml:space="preserve"> </w:t>
+      </w:r>
+      <w:r>
+        <w:rPr>
+          <w:rStyle w:val="VerbatimChar"/>
+        </w:rPr>
+        <w:t xml:space="preserve">DomainEventEnvelopeTest</w:t>
+      </w:r>
+      <w:r>
+        <w:t xml:space="preserve">).</w:t>
       </w:r>
     </w:p>
     <w:p>

</xml_diff>

<commit_message>
docs(tests): regenerate the PDF and Word
</commit_message>
<xml_diff>
--- a/06_DOCUMENTACION_DE_PRUEBAS/EN/WORD/06_Test_Documentation.docx
+++ b/06_DOCUMENTACION_DE_PRUEBAS/EN/WORD/06_Test_Documentation.docx
@@ -268,7 +268,7 @@
               <w:pStyle w:val="Compact"/>
             </w:pPr>
             <w:r>
-              <w:t xml:space="preserve">October 26, 2026</w:t>
+              <w:t xml:space="preserve">October 27, 2026</w:t>
             </w:r>
           </w:p>
         </w:tc>
@@ -279,7 +279,7 @@
         <w:pStyle w:val="BodyText"/>
       </w:pPr>
       <w:r>
-        <w:t xml:space="preserve">This document gathers the test plan, the inventory of automated tests in the repositories, their actual results when run on October 19, 2026 (including the end-to-end, performance, and responsive design tests against the complete system) and again on October 21, and the 42 functional test cases, run on October 19, traced to the SRS v8.0 requirements (</w:t>
+        <w:t xml:space="preserve">This document gathers the test plan, the inventory of automated tests in the repositories, their actual results when run on October 19, 2026 (including the end-to-end, performance, and responsive design tests against the complete system) and again on October 21, and the 42 functional test cases, run on October 19, traced to the SRS v8.3 requirements (</w:t>
       </w:r>
       <w:r>
         <w:rPr>
@@ -320,7 +320,22 @@
         <w:t xml:space="preserve"> </w:t>
       </w:r>
       <w:r>
-        <w:t xml:space="preserve">and deploying them to the public server, the inventory (Table 4), the results of the latest CI (section 3.3, Table 5d), the traceability matrix (eight requirements move to Implemented), and the gaps (Table 8) were updated again; the same day, notification migration 048, which fixed what the live test found in 047, was added to gap 9. On October 26, 2026 the live tests of payment at booking were added, locally and in production, with the two simulated failures (section 3.4, Table 5e), the new test count of booking, payment, the web, and the mobile app (Table 5f), defect 13 (Table 9), and gaps 9 and 10 (Table 8). On October 23, 2026 the inventory (Table 2), the results of the latest</w:t>
+        <w:t xml:space="preserve">and deploying them to the public server, the inventory (Table 4), the results of the latest CI (section 3.3, Table 5d), the traceability matrix (eight requirements move to Implemented), and the gaps (Table 8) were updated again; the same day, notification migration 048, which fixed what the live test found in 047, was added to gap 9. On October 26, 2026 the live tests of payment at booking were added, locally and in production, with the two simulated failures (section 3.4, Table 5e), the new test count of booking, payment, the web, and the mobile app (Table 5f), defect 13 (Table 9), and gaps 9 and 10 (Table 8). On October 27, 2026, against</w:t>
+      </w:r>
+      <w:r>
+        <w:t xml:space="preserve"> </w:t>
+      </w:r>
+      <w:r>
+        <w:rPr>
+          <w:rStyle w:val="VerbatimChar"/>
+        </w:rPr>
+        <w:t xml:space="preserve">main</w:t>
+      </w:r>
+      <w:r>
+        <w:t xml:space="preserve"> </w:t>
+      </w:r>
+      <w:r>
+        <w:t xml:space="preserve">of that day, the counts (Table 5f: 1,337 tests, with payment's 17 integration tests, which now run in the CI against SQL Server), the end-to-end run (section 3.1: 19 of 19), the booking step of CP-08, the new cases CP-43 to CP-46, and gaps 1 to 3 (Table 8) were updated. On October 23, 2026 the inventory (Table 2), the results of the latest</w:t>
       </w:r>
       <w:r>
         <w:t xml:space="preserve"> </w:t>
@@ -2357,7 +2372,7 @@
               <w:t xml:space="preserve">PaymentService.Api.UnitTests</w:t>
             </w:r>
             <w:r>
-              <w:t xml:space="preserve">), payment and receipt (2 MB maximum), reused reference, history with filters, promotions, loyalty points, payment policy, command and query services, and 11 persistence tests against SQL Server</w:t>
+              <w:t xml:space="preserve">), payment and receipt (2 MB maximum), reused reference, history with filters, promotions, loyalty points, payment policy, command and query services, and the persistence tests against SQL Server (11 as of October 24; 17 integration tests since October 27, 2026, which run in the CI)</w:t>
             </w:r>
           </w:p>
         </w:tc>
@@ -2690,7 +2705,7 @@
         <w:t xml:space="preserve">DatabaseFixture.cs:16-21</w:t>
       </w:r>
       <w:r>
-        <w:t xml:space="preserve">).</w:t>
+        <w:t xml:space="preserve">). Since October 27, 2026 they are 17 integration tests and the CI runs them in the "Pruebas de integración" job, against SQL Server 2022 with the Liquibase migrations, without skipping any; on a machine without a database, 12 are skipped.</w:t>
       </w:r>
     </w:p>
     <w:p>
@@ -4525,7 +4540,43 @@
         <w:t xml:space="preserve"> </w:t>
       </w:r>
       <w:r>
-        <w:t xml:space="preserve">(the test operator of the local database). The 19 tests passed in 11.2 s. Each test deletes what it creates and leaves the customer's points as they were. On October 21, 2026, the team ran them again, early in the morning and in the evening, with the gateway session check on, and all 19 passed both times; the files in Table 5a have not changed since October 18.</w:t>
+        <w:t xml:space="preserve">(the test operator of the local database). The 19 tests passed in 11.2 s. Each test deletes what it creates and leaves the customer's points as they were. On October 21, 2026, the team ran them again, early in the morning and in the evening, with the gateway session check on, and all 19 passed both times; the files in Table 5a have not changed since October 18. On October 27, 2026 they were run again against the local system with the</w:t>
+      </w:r>
+      <w:r>
+        <w:t xml:space="preserve"> </w:t>
+      </w:r>
+      <w:r>
+        <w:rPr>
+          <w:rStyle w:val="VerbatimChar"/>
+        </w:rPr>
+        <w:t xml:space="preserve">main</w:t>
+      </w:r>
+      <w:r>
+        <w:t xml:space="preserve"> </w:t>
+      </w:r>
+      <w:r>
+        <w:t xml:space="preserve">code and passed 19 of 19, after the suite was adjusted to send the payment mode (</w:t>
+      </w:r>
+      <w:r>
+        <w:rPr>
+          <w:rStyle w:val="VerbatimChar"/>
+        </w:rPr>
+        <w:t xml:space="preserve">paymentMode</w:t>
+      </w:r>
+      <w:r>
+        <w:t xml:space="preserve">) when booking: booking-service requires it since October 26, and without it the tests that book failed with 400</w:t>
+      </w:r>
+      <w:r>
+        <w:t xml:space="preserve"> </w:t>
+      </w:r>
+      <w:r>
+        <w:rPr>
+          <w:rStyle w:val="VerbatimChar"/>
+        </w:rPr>
+        <w:t xml:space="preserve">INVALID_PAYMENT_MODE</w:t>
+      </w:r>
+      <w:r>
+        <w:t xml:space="preserve">.</w:t>
       </w:r>
     </w:p>
     <w:p>
@@ -8428,7 +8479,7 @@
           <w:i/>
           <w:iCs/>
         </w:rPr>
-        <w:t xml:space="preserve">Automated tests that changed with payment at booking (develop, October 26, 2026)</w:t>
+        <w:t xml:space="preserve">Automated tests that changed with payment at booking (develop of October 26 and main of October 27, 2026)</w:t>
       </w:r>
     </w:p>
     <w:tbl>
@@ -8511,7 +8562,7 @@
               <w:pStyle w:val="Compact"/>
             </w:pPr>
             <w:r>
-              <w:t xml:space="preserve">133</w:t>
+              <w:t xml:space="preserve">137 (133 on October 26)</w:t>
             </w:r>
           </w:p>
         </w:tc>
@@ -8650,7 +8701,7 @@
               <w:pStyle w:val="Compact"/>
             </w:pPr>
             <w:r>
-              <w:t xml:space="preserve">247: domain 142, application 61, API 44</w:t>
+              <w:t xml:space="preserve">264: domain 142, application 61, API 44, and integration 17 (247 on October 26, without the integration tests)</w:t>
             </w:r>
           </w:p>
         </w:tc>
@@ -8720,7 +8771,7 @@
               <w:t xml:space="preserve">BOOKING_NOT_PAYABLE</w:t>
             </w:r>
             <w:r>
-              <w:t xml:space="preserve">). It does not count the integration tests, which are skipped without SQL Server</w:t>
+              <w:t xml:space="preserve">). The 17 integration tests run in the CI against SQL Server 2022 since October 27, 2026</w:t>
             </w:r>
           </w:p>
         </w:tc>
@@ -8744,7 +8795,7 @@
               <w:pStyle w:val="Compact"/>
             </w:pPr>
             <w:r>
-              <w:t xml:space="preserve">239</w:t>
+              <w:t xml:space="preserve">242 in 68 files (239 on October 26)</w:t>
             </w:r>
           </w:p>
         </w:tc>
@@ -8790,7 +8841,7 @@
               <w:pStyle w:val="Compact"/>
             </w:pPr>
             <w:r>
-              <w:t xml:space="preserve">100</w:t>
+              <w:t xml:space="preserve">106 (100 on October 26)</w:t>
             </w:r>
           </w:p>
         </w:tc>
@@ -8874,7 +8925,35 @@
         <w:t xml:space="preserve"> </w:t>
       </w:r>
       <w:r>
-        <w:t xml:space="preserve">OTA on October 26, 2026. On October 27, 2026 booking-service went up to 137 tests (alternatives that respect the vehicle's other bookings, at most 10 services, and 400 for an invalid business hours week) and customer-service to 83 (owners of many vehicles in one query), for 1,311 with the same criterion,, and the end-to-end tests send the payment method.</w:t>
+        <w:t xml:space="preserve">OTA on October 26, 2026. On October 27, 2026 booking-service went up to 137 tests (alternatives that respect the vehicle's other bookings, at most 10 services, and 400 for an invalid business hours week) and customer-service to 83 (owners of many vehicles in one query), for 1,311 with the same criterion, and the end-to-end tests send the payment method. In the</w:t>
+      </w:r>
+      <w:r>
+        <w:t xml:space="preserve"> </w:t>
+      </w:r>
+      <w:r>
+        <w:rPr>
+          <w:rStyle w:val="VerbatimChar"/>
+        </w:rPr>
+        <w:t xml:space="preserve">main</w:t>
+      </w:r>
+      <w:r>
+        <w:t xml:space="preserve"> </w:t>
+      </w:r>
+      <w:r>
+        <w:t xml:space="preserve">CI of October 27, 2026 all of them passed: gateway 62, security-service 200, customer-service 83, booking-service 137, operations-service 110, notification-service 133, and payment-service 264 (989 in the backend), web 242, and mobile app 106, for a total of</w:t>
+      </w:r>
+      <w:r>
+        <w:t xml:space="preserve"> </w:t>
+      </w:r>
+      <w:r>
+        <w:rPr>
+          <w:b/>
+          <w:bCs/>
+        </w:rPr>
+        <w:t xml:space="preserve">1,337</w:t>
+      </w:r>
+      <w:r>
+        <w:t xml:space="preserve">, which already includes payment's 17 integration tests.</w:t>
       </w:r>
     </w:p>
     <w:bookmarkEnd w:id="37"/>
@@ -8893,7 +8972,22 @@
         <w:pStyle w:val="FirstParagraph"/>
       </w:pPr>
       <w:r>
-        <w:t xml:space="preserve">Cases CP-01 to CP-33 were defined on SRS v4 and first run on October 9, 2026; cases CP-34 to CP-42 cover the requirements implemented afterwards (RF-004b, RF-008, RF-010, RF-015, RF-022, RF-036, RF-037, and RF-038) and the administrator accounts of RF-028. All 42 were run on October 19, 2026, against the full system through the API Gateway (the same calls the web and mobile clients make), with a script that creates its own accounts and data and deletes them at the end. All 42 passed (Figure 7). The changes of October 21, 2026 (the token of a closed session, the close of expired bookings, and the receipt of at most 2 MB) do not have a functional case of their own yet; the automated tests in Table 5 cover them (gap 7 in Table 8).</w:t>
+        <w:t xml:space="preserve">Cases CP-01 to CP-33 were defined on SRS v4 and first run on October 9, 2026; cases CP-34 to CP-42 cover the requirements implemented afterwards (RF-004b, RF-008, RF-010, RF-015, RF-022, RF-036, RF-037, and RF-038) and the administrator accounts of RF-028. All 42 were run on October 19, 2026, against the full system through the API Gateway (the same calls the web and mobile clients make), with a script that creates its own accounts and data and deletes them at the end. All 42 passed (Figure 7). The changes of October 21, 2026 (the token of a closed session, the close of expired bookings, and the receipt of at most 2 MB) do not have a functional case of their own yet; the automated tests in Table 5 cover them (gap 7 in Table 8). Cases CP-43 to CP-46 were added on October 27, 2026 for payment at booking and the new booking-service validations; the October 19 script did not run them: their result is that of the booking-service automated tests that cover them, green in the</w:t>
+      </w:r>
+      <w:r>
+        <w:t xml:space="preserve"> </w:t>
+      </w:r>
+      <w:r>
+        <w:rPr>
+          <w:rStyle w:val="VerbatimChar"/>
+        </w:rPr>
+        <w:t xml:space="preserve">main</w:t>
+      </w:r>
+      <w:r>
+        <w:t xml:space="preserve"> </w:t>
+      </w:r>
+      <w:r>
+        <w:t xml:space="preserve">CI of October 27 (137 tests).</w:t>
       </w:r>
     </w:p>
     <w:p>
@@ -9887,18 +9981,60 @@
               <w:pStyle w:val="Compact"/>
             </w:pPr>
             <w:r>
-              <w:t xml:space="preserve">Choose vehicle, Basic service, a free date and time</w:t>
-            </w:r>
-          </w:p>
-        </w:tc>
-        <w:tc>
-          <w:tcPr/>
-          <w:p>
-            <w:pPr>
-              <w:pStyle w:val="Compact"/>
-            </w:pPr>
-            <w:r>
-              <w:t xml:space="preserve">SUV, Basic</w:t>
+              <w:t xml:space="preserve">Choose vehicle, Basic service, a free date and time and, since October 26, 2026, the payment method (</w:t>
+            </w:r>
+            <w:r>
+              <w:rPr>
+                <w:rStyle w:val="VerbatimChar"/>
+              </w:rPr>
+              <w:t xml:space="preserve">paymentMode</w:t>
+            </w:r>
+            <w:r>
+              <w:t xml:space="preserve">)</w:t>
+            </w:r>
+          </w:p>
+        </w:tc>
+        <w:tc>
+          <w:tcPr/>
+          <w:p>
+            <w:pPr>
+              <w:pStyle w:val="Compact"/>
+            </w:pPr>
+            <w:r>
+              <w:t xml:space="preserve">SUV, Basic,</w:t>
+            </w:r>
+            <w:r>
+              <w:t xml:space="preserve"> </w:t>
+            </w:r>
+            <w:r>
+              <w:rPr>
+                <w:rStyle w:val="VerbatimChar"/>
+              </w:rPr>
+              <w:t xml:space="preserve">paymentMode</w:t>
+            </w:r>
+            <w:r>
+              <w:t xml:space="preserve"> </w:t>
+            </w:r>
+            <w:r>
+              <w:rPr>
+                <w:rStyle w:val="VerbatimChar"/>
+              </w:rPr>
+              <w:t xml:space="preserve">DIGITAL</w:t>
+            </w:r>
+            <w:r>
+              <w:t xml:space="preserve"> </w:t>
+            </w:r>
+            <w:r>
+              <w:t xml:space="preserve">or</w:t>
+            </w:r>
+            <w:r>
+              <w:t xml:space="preserve"> </w:t>
+            </w:r>
+            <w:r>
+              <w:rPr>
+                <w:rStyle w:val="VerbatimChar"/>
+              </w:rPr>
+              <w:t xml:space="preserve">CASH</w:t>
             </w:r>
           </w:p>
         </w:tc>
@@ -13607,6 +13743,689 @@
                 <w:rStyle w:val="VerbatimChar"/>
               </w:rPr>
               <w:t xml:space="preserve">ADMIN_CANNOT_BE_DISABLED</w:t>
+            </w:r>
+          </w:p>
+        </w:tc>
+        <w:tc>
+          <w:tcPr/>
+          <w:p>
+            <w:pPr>
+              <w:pStyle w:val="Compact"/>
+            </w:pPr>
+            <w:r>
+              <w:t xml:space="preserve">Passed</w:t>
+            </w:r>
+          </w:p>
+        </w:tc>
+      </w:tr>
+      <w:tr>
+        <w:tc>
+          <w:tcPr/>
+          <w:p>
+            <w:pPr>
+              <w:pStyle w:val="Compact"/>
+            </w:pPr>
+            <w:r>
+              <w:t xml:space="preserve">CP-43</w:t>
+            </w:r>
+          </w:p>
+        </w:tc>
+        <w:tc>
+          <w:tcPr/>
+          <w:p>
+            <w:pPr>
+              <w:pStyle w:val="Compact"/>
+            </w:pPr>
+            <w:r>
+              <w:t xml:space="preserve">RF-005</w:t>
+            </w:r>
+          </w:p>
+        </w:tc>
+        <w:tc>
+          <w:tcPr/>
+          <w:p>
+            <w:pPr>
+              <w:pStyle w:val="Compact"/>
+            </w:pPr>
+            <w:r>
+              <w:t xml:space="preserve">Payment mode is required</w:t>
+            </w:r>
+          </w:p>
+        </w:tc>
+        <w:tc>
+          <w:tcPr/>
+          <w:p>
+            <w:pPr>
+              <w:pStyle w:val="Compact"/>
+            </w:pPr>
+            <w:r>
+              <w:t xml:space="preserve">Customer with a vehicle</w:t>
+            </w:r>
+          </w:p>
+        </w:tc>
+        <w:tc>
+          <w:tcPr/>
+          <w:p>
+            <w:pPr>
+              <w:pStyle w:val="Compact"/>
+            </w:pPr>
+            <w:r>
+              <w:t xml:space="preserve">Book without</w:t>
+            </w:r>
+            <w:r>
+              <w:t xml:space="preserve"> </w:t>
+            </w:r>
+            <w:r>
+              <w:rPr>
+                <w:rStyle w:val="VerbatimChar"/>
+              </w:rPr>
+              <w:t xml:space="preserve">paymentMode</w:t>
+            </w:r>
+            <w:r>
+              <w:t xml:space="preserve"> </w:t>
+            </w:r>
+            <w:r>
+              <w:t xml:space="preserve">and then with a mode that does not exist</w:t>
+            </w:r>
+          </w:p>
+        </w:tc>
+        <w:tc>
+          <w:tcPr/>
+          <w:p>
+            <w:pPr>
+              <w:pStyle w:val="Compact"/>
+            </w:pPr>
+            <w:r>
+              <w:t xml:space="preserve">No</w:t>
+            </w:r>
+            <w:r>
+              <w:t xml:space="preserve"> </w:t>
+            </w:r>
+            <w:r>
+              <w:rPr>
+                <w:rStyle w:val="VerbatimChar"/>
+              </w:rPr>
+              <w:t xml:space="preserve">paymentMode</w:t>
+            </w:r>
+            <w:r>
+              <w:t xml:space="preserve">;</w:t>
+            </w:r>
+            <w:r>
+              <w:t xml:space="preserve"> </w:t>
+            </w:r>
+            <w:r>
+              <w:rPr>
+                <w:rStyle w:val="VerbatimChar"/>
+              </w:rPr>
+              <w:t xml:space="preserve">CARD</w:t>
+            </w:r>
+          </w:p>
+        </w:tc>
+        <w:tc>
+          <w:tcPr/>
+          <w:p>
+            <w:pPr>
+              <w:pStyle w:val="Compact"/>
+            </w:pPr>
+            <w:r>
+              <w:t xml:space="preserve">The booking is rejected with 400</w:t>
+            </w:r>
+            <w:r>
+              <w:t xml:space="preserve"> </w:t>
+            </w:r>
+            <w:r>
+              <w:rPr>
+                <w:rStyle w:val="VerbatimChar"/>
+              </w:rPr>
+              <w:t xml:space="preserve">INVALID_PAYMENT_MODE</w:t>
+            </w:r>
+            <w:r>
+              <w:t xml:space="preserve"> </w:t>
+            </w:r>
+            <w:r>
+              <w:t xml:space="preserve">and is not saved</w:t>
+            </w:r>
+          </w:p>
+        </w:tc>
+        <w:tc>
+          <w:tcPr/>
+          <w:p>
+            <w:pPr>
+              <w:pStyle w:val="Compact"/>
+            </w:pPr>
+            <w:r>
+              <w:t xml:space="preserve">Meets (automated test green in the CI of 10-27:</w:t>
+            </w:r>
+            <w:r>
+              <w:t xml:space="preserve"> </w:t>
+            </w:r>
+            <w:r>
+              <w:rPr>
+                <w:rStyle w:val="VerbatimChar"/>
+              </w:rPr>
+              <w:t xml:space="preserve">PaymentPolicyTest</w:t>
+            </w:r>
+            <w:r>
+              <w:t xml:space="preserve">,</w:t>
+            </w:r>
+            <w:r>
+              <w:t xml:space="preserve"> </w:t>
+            </w:r>
+            <w:r>
+              <w:rPr>
+                <w:rStyle w:val="VerbatimChar"/>
+              </w:rPr>
+              <w:t xml:space="preserve">BookingServiceTest</w:t>
+            </w:r>
+            <w:r>
+              <w:t xml:space="preserve">, and</w:t>
+            </w:r>
+            <w:r>
+              <w:t xml:space="preserve"> </w:t>
+            </w:r>
+            <w:r>
+              <w:rPr>
+                <w:rStyle w:val="VerbatimChar"/>
+              </w:rPr>
+              <w:t xml:space="preserve">BookingApiWebTest.paymentRuleErrorsKeepTheirCodes</w:t>
+            </w:r>
+            <w:r>
+              <w:t xml:space="preserve">)</w:t>
+            </w:r>
+          </w:p>
+        </w:tc>
+        <w:tc>
+          <w:tcPr/>
+          <w:p>
+            <w:pPr>
+              <w:pStyle w:val="Compact"/>
+            </w:pPr>
+            <w:r>
+              <w:t xml:space="preserve">Passed</w:t>
+            </w:r>
+          </w:p>
+        </w:tc>
+      </w:tr>
+      <w:tr>
+        <w:tc>
+          <w:tcPr/>
+          <w:p>
+            <w:pPr>
+              <w:pStyle w:val="Compact"/>
+            </w:pPr>
+            <w:r>
+              <w:t xml:space="preserve">CP-44</w:t>
+            </w:r>
+          </w:p>
+        </w:tc>
+        <w:tc>
+          <w:tcPr/>
+          <w:p>
+            <w:pPr>
+              <w:pStyle w:val="Compact"/>
+            </w:pPr>
+            <w:r>
+              <w:t xml:space="preserve">RF-005</w:t>
+            </w:r>
+          </w:p>
+        </w:tc>
+        <w:tc>
+          <w:tcPr/>
+          <w:p>
+            <w:pPr>
+              <w:pStyle w:val="Compact"/>
+            </w:pPr>
+            <w:r>
+              <w:t xml:space="preserve">Cash booking limit</w:t>
+            </w:r>
+          </w:p>
+        </w:tc>
+        <w:tc>
+          <w:tcPr/>
+          <w:p>
+            <w:pPr>
+              <w:pStyle w:val="Compact"/>
+            </w:pPr>
+            <w:r>
+              <w:t xml:space="preserve">Customer with one active cash booking made by themselves</w:t>
+            </w:r>
+          </w:p>
+        </w:tc>
+        <w:tc>
+          <w:tcPr/>
+          <w:p>
+            <w:pPr>
+              <w:pStyle w:val="Compact"/>
+            </w:pPr>
+            <w:r>
+              <w:t xml:space="preserve">Make another cash booking</w:t>
+            </w:r>
+          </w:p>
+        </w:tc>
+        <w:tc>
+          <w:tcPr/>
+          <w:p>
+            <w:pPr>
+              <w:pStyle w:val="Compact"/>
+            </w:pPr>
+            <w:r>
+              <w:rPr>
+                <w:rStyle w:val="VerbatimChar"/>
+              </w:rPr>
+              <w:t xml:space="preserve">paymentMode</w:t>
+            </w:r>
+            <w:r>
+              <w:t xml:space="preserve"> </w:t>
+            </w:r>
+            <w:r>
+              <w:rPr>
+                <w:rStyle w:val="VerbatimChar"/>
+              </w:rPr>
+              <w:t xml:space="preserve">CASH</w:t>
+            </w:r>
+          </w:p>
+        </w:tc>
+        <w:tc>
+          <w:tcPr/>
+          <w:p>
+            <w:pPr>
+              <w:pStyle w:val="Compact"/>
+            </w:pPr>
+            <w:r>
+              <w:t xml:space="preserve">409</w:t>
+            </w:r>
+            <w:r>
+              <w:t xml:space="preserve"> </w:t>
+            </w:r>
+            <w:r>
+              <w:rPr>
+                <w:rStyle w:val="VerbatimChar"/>
+              </w:rPr>
+              <w:t xml:space="preserve">CASH_BOOKING_LIMIT</w:t>
+            </w:r>
+            <w:r>
+              <w:t xml:space="preserve">; nothing is saved</w:t>
+            </w:r>
+          </w:p>
+        </w:tc>
+        <w:tc>
+          <w:tcPr/>
+          <w:p>
+            <w:pPr>
+              <w:pStyle w:val="Compact"/>
+            </w:pPr>
+            <w:r>
+              <w:t xml:space="preserve">Meets (automated test green in the CI of 10-27:</w:t>
+            </w:r>
+            <w:r>
+              <w:t xml:space="preserve"> </w:t>
+            </w:r>
+            <w:r>
+              <w:rPr>
+                <w:rStyle w:val="VerbatimChar"/>
+              </w:rPr>
+              <w:t xml:space="preserve">PaymentPolicyTest</w:t>
+            </w:r>
+            <w:r>
+              <w:t xml:space="preserve">,</w:t>
+            </w:r>
+            <w:r>
+              <w:t xml:space="preserve"> </w:t>
+            </w:r>
+            <w:r>
+              <w:rPr>
+                <w:rStyle w:val="VerbatimChar"/>
+              </w:rPr>
+              <w:t xml:space="preserve">BookingServiceTest</w:t>
+            </w:r>
+            <w:r>
+              <w:t xml:space="preserve">, and</w:t>
+            </w:r>
+            <w:r>
+              <w:t xml:space="preserve"> </w:t>
+            </w:r>
+            <w:r>
+              <w:rPr>
+                <w:rStyle w:val="VerbatimChar"/>
+              </w:rPr>
+              <w:t xml:space="preserve">BookingApiWebTest.paymentRuleErrorsKeepTheirCodes</w:t>
+            </w:r>
+            <w:r>
+              <w:t xml:space="preserve">)</w:t>
+            </w:r>
+          </w:p>
+        </w:tc>
+        <w:tc>
+          <w:tcPr/>
+          <w:p>
+            <w:pPr>
+              <w:pStyle w:val="Compact"/>
+            </w:pPr>
+            <w:r>
+              <w:t xml:space="preserve">Passed</w:t>
+            </w:r>
+          </w:p>
+        </w:tc>
+      </w:tr>
+      <w:tr>
+        <w:tc>
+          <w:tcPr/>
+          <w:p>
+            <w:pPr>
+              <w:pStyle w:val="Compact"/>
+            </w:pPr>
+            <w:r>
+              <w:t xml:space="preserve">CP-45</w:t>
+            </w:r>
+          </w:p>
+        </w:tc>
+        <w:tc>
+          <w:tcPr/>
+          <w:p>
+            <w:pPr>
+              <w:pStyle w:val="Compact"/>
+            </w:pPr>
+            <w:r>
+              <w:t xml:space="preserve">RF-005</w:t>
+            </w:r>
+          </w:p>
+        </w:tc>
+        <w:tc>
+          <w:tcPr/>
+          <w:p>
+            <w:pPr>
+              <w:pStyle w:val="Compact"/>
+            </w:pPr>
+            <w:r>
+              <w:t xml:space="preserve">At most 10 services per booking</w:t>
+            </w:r>
+          </w:p>
+        </w:tc>
+        <w:tc>
+          <w:tcPr/>
+          <w:p>
+            <w:pPr>
+              <w:pStyle w:val="Compact"/>
+            </w:pPr>
+            <w:r>
+              <w:t xml:space="preserve">Customer with a vehicle; administrator session</w:t>
+            </w:r>
+          </w:p>
+        </w:tc>
+        <w:tc>
+          <w:tcPr/>
+          <w:p>
+            <w:pPr>
+              <w:pStyle w:val="Compact"/>
+            </w:pPr>
+            <w:r>
+              <w:t xml:space="preserve">Book with</w:t>
+            </w:r>
+            <w:r>
+              <w:t xml:space="preserve"> </w:t>
+            </w:r>
+            <w:r>
+              <w:rPr>
+                <w:rStyle w:val="VerbatimChar"/>
+              </w:rPr>
+              <w:t xml:space="preserve">serviceIds</w:t>
+            </w:r>
+            <w:r>
+              <w:t xml:space="preserve"> </w:t>
+            </w:r>
+            <w:r>
+              <w:rPr>
+                <w:rStyle w:val="VerbatimChar"/>
+              </w:rPr>
+              <w:t xml:space="preserve">[null]</w:t>
+            </w:r>
+            <w:r>
+              <w:t xml:space="preserve"> </w:t>
+            </w:r>
+            <w:r>
+              <w:t xml:space="preserve">and with 11 services; reschedule as administrator with</w:t>
+            </w:r>
+            <w:r>
+              <w:t xml:space="preserve"> </w:t>
+            </w:r>
+            <w:r>
+              <w:rPr>
+                <w:rStyle w:val="VerbatimChar"/>
+              </w:rPr>
+              <w:t xml:space="preserve">[null]</w:t>
+            </w:r>
+          </w:p>
+        </w:tc>
+        <w:tc>
+          <w:tcPr/>
+          <w:p>
+            <w:pPr>
+              <w:pStyle w:val="Compact"/>
+            </w:pPr>
+            <w:r>
+              <w:rPr>
+                <w:rStyle w:val="VerbatimChar"/>
+              </w:rPr>
+              <w:t xml:space="preserve">serviceIds</w:t>
+            </w:r>
+            <w:r>
+              <w:t xml:space="preserve"> </w:t>
+            </w:r>
+            <w:r>
+              <w:rPr>
+                <w:rStyle w:val="VerbatimChar"/>
+              </w:rPr>
+              <w:t xml:space="preserve">[null]</w:t>
+            </w:r>
+            <w:r>
+              <w:t xml:space="preserve"> </w:t>
+            </w:r>
+            <w:r>
+              <w:t xml:space="preserve">and</w:t>
+            </w:r>
+            <w:r>
+              <w:t xml:space="preserve"> </w:t>
+            </w:r>
+            <w:r>
+              <w:rPr>
+                <w:rStyle w:val="VerbatimChar"/>
+              </w:rPr>
+              <w:t xml:space="preserve">[1..11]</w:t>
+            </w:r>
+          </w:p>
+        </w:tc>
+        <w:tc>
+          <w:tcPr/>
+          <w:p>
+            <w:pPr>
+              <w:pStyle w:val="Compact"/>
+            </w:pPr>
+            <w:r>
+              <w:t xml:space="preserve">400</w:t>
+            </w:r>
+            <w:r>
+              <w:t xml:space="preserve"> </w:t>
+            </w:r>
+            <w:r>
+              <w:rPr>
+                <w:rStyle w:val="VerbatimChar"/>
+              </w:rPr>
+              <w:t xml:space="preserve">VALIDATION_ERROR</w:t>
+            </w:r>
+            <w:r>
+              <w:t xml:space="preserve"> </w:t>
+            </w:r>
+            <w:r>
+              <w:t xml:space="preserve">(500 before); the use case is not called</w:t>
+            </w:r>
+          </w:p>
+        </w:tc>
+        <w:tc>
+          <w:tcPr/>
+          <w:p>
+            <w:pPr>
+              <w:pStyle w:val="Compact"/>
+            </w:pPr>
+            <w:r>
+              <w:t xml:space="preserve">Meets (automated test green in the CI of 10-27:</w:t>
+            </w:r>
+            <w:r>
+              <w:t xml:space="preserve"> </w:t>
+            </w:r>
+            <w:r>
+              <w:rPr>
+                <w:rStyle w:val="VerbatimChar"/>
+              </w:rPr>
+              <w:t xml:space="preserve">BookingApiWebTest.nullOrTooManyServicesAreValidationErrors</w:t>
+            </w:r>
+            <w:r>
+              <w:t xml:space="preserve">)</w:t>
+            </w:r>
+          </w:p>
+        </w:tc>
+        <w:tc>
+          <w:tcPr/>
+          <w:p>
+            <w:pPr>
+              <w:pStyle w:val="Compact"/>
+            </w:pPr>
+            <w:r>
+              <w:t xml:space="preserve">Passed</w:t>
+            </w:r>
+          </w:p>
+        </w:tc>
+      </w:tr>
+      <w:tr>
+        <w:tc>
+          <w:tcPr/>
+          <w:p>
+            <w:pPr>
+              <w:pStyle w:val="Compact"/>
+            </w:pPr>
+            <w:r>
+              <w:t xml:space="preserve">CP-46</w:t>
+            </w:r>
+          </w:p>
+        </w:tc>
+        <w:tc>
+          <w:tcPr/>
+          <w:p>
+            <w:pPr>
+              <w:pStyle w:val="Compact"/>
+            </w:pPr>
+            <w:r>
+              <w:t xml:space="preserve">RF-021</w:t>
+            </w:r>
+          </w:p>
+        </w:tc>
+        <w:tc>
+          <w:tcPr/>
+          <w:p>
+            <w:pPr>
+              <w:pStyle w:val="Compact"/>
+            </w:pPr>
+            <w:r>
+              <w:t xml:space="preserve">Invalid day in the weekly opening hours</w:t>
+            </w:r>
+          </w:p>
+        </w:tc>
+        <w:tc>
+          <w:tcPr/>
+          <w:p>
+            <w:pPr>
+              <w:pStyle w:val="Compact"/>
+            </w:pPr>
+            <w:r>
+              <w:t xml:space="preserve">Administrator session</w:t>
+            </w:r>
+          </w:p>
+        </w:tc>
+        <w:tc>
+          <w:tcPr/>
+          <w:p>
+            <w:pPr>
+              <w:pStyle w:val="Compact"/>
+            </w:pPr>
+            <w:r>
+              <w:t xml:space="preserve">Save the opening-hours week with a day that does not exist and then with an empty list</w:t>
+            </w:r>
+          </w:p>
+        </w:tc>
+        <w:tc>
+          <w:tcPr/>
+          <w:p>
+            <w:pPr>
+              <w:pStyle w:val="Compact"/>
+            </w:pPr>
+            <w:r>
+              <w:rPr>
+                <w:rStyle w:val="VerbatimChar"/>
+              </w:rPr>
+              <w:t xml:space="preserve">dayOfWeek</w:t>
+            </w:r>
+            <w:r>
+              <w:t xml:space="preserve"> </w:t>
+            </w:r>
+            <w:r>
+              <w:t xml:space="preserve">9;</w:t>
+            </w:r>
+            <w:r>
+              <w:t xml:space="preserve"> </w:t>
+            </w:r>
+            <w:r>
+              <w:rPr>
+                <w:rStyle w:val="VerbatimChar"/>
+              </w:rPr>
+              <w:t xml:space="preserve">[]</w:t>
+            </w:r>
+          </w:p>
+        </w:tc>
+        <w:tc>
+          <w:tcPr/>
+          <w:p>
+            <w:pPr>
+              <w:pStyle w:val="Compact"/>
+            </w:pPr>
+            <w:r>
+              <w:t xml:space="preserve">400</w:t>
+            </w:r>
+            <w:r>
+              <w:t xml:space="preserve"> </w:t>
+            </w:r>
+            <w:r>
+              <w:rPr>
+                <w:rStyle w:val="VerbatimChar"/>
+              </w:rPr>
+              <w:t xml:space="preserve">VALIDATION_ERROR</w:t>
+            </w:r>
+            <w:r>
+              <w:t xml:space="preserve"> </w:t>
+            </w:r>
+            <w:r>
+              <w:t xml:space="preserve">(500 before); the opening hours do not change</w:t>
+            </w:r>
+          </w:p>
+        </w:tc>
+        <w:tc>
+          <w:tcPr/>
+          <w:p>
+            <w:pPr>
+              <w:pStyle w:val="Compact"/>
+            </w:pPr>
+            <w:r>
+              <w:t xml:space="preserve">Meets (automated test green in the CI of 10-27:</w:t>
+            </w:r>
+            <w:r>
+              <w:t xml:space="preserve"> </w:t>
+            </w:r>
+            <w:r>
+              <w:rPr>
+                <w:rStyle w:val="VerbatimChar"/>
+              </w:rPr>
+              <w:t xml:space="preserve">BookingApiWebTest.anInvalidDayInTheWeekIsAValidationError</w:t>
+            </w:r>
+            <w:r>
+              <w:t xml:space="preserve">)</w:t>
             </w:r>
           </w:p>
         </w:tc>
@@ -13796,7 +14615,7 @@
         <w:pStyle w:val="FirstParagraph"/>
       </w:pPr>
       <w:r>
-        <w:t xml:space="preserve">Of the 41 requirements in SRS v8.0 (3 of them partial as of October 24, 2026: RF-005, RF-015, and RF-023, with the reason in the SRS; on October 23 there were 11), 38 have a functional case and 39 a related automated test; RF-032 and RF-034 only have a functional case, and RF-017, RF-023, and RF-025 only an automated test.</w:t>
+        <w:t xml:space="preserve">Of the 41 requirements in SRS v8.3 (3 of them partial as of October 27, 2026: RF-005, RF-015, and RF-023, with the reason in the SRS; on October 23 there were 11), 38 have a functional case and 39 a related automated test; RF-032 and RF-034 only have a functional case, and RF-017, RF-023, and RF-025 only an automated test.</w:t>
       </w:r>
     </w:p>
     <w:p>
@@ -13859,7 +14678,7 @@
               <w:pStyle w:val="Compact"/>
             </w:pPr>
             <w:r>
-              <w:t xml:space="preserve">Status (SRS v8.0)</w:t>
+              <w:t xml:space="preserve">Status (SRS v8.3)</w:t>
             </w:r>
           </w:p>
         </w:tc>
@@ -15162,7 +15981,7 @@
               <w:pStyle w:val="Compact"/>
             </w:pPr>
             <w:r>
-              <w:t xml:space="preserve">CP-22</w:t>
+              <w:t xml:space="preserve">CP-22, CP-46</w:t>
             </w:r>
           </w:p>
         </w:tc>
@@ -15177,6 +15996,18 @@
                 <w:rStyle w:val="VerbatimChar"/>
               </w:rPr>
               <w:t xml:space="preserve">AvailabilityPolicyTest</w:t>
+            </w:r>
+            <w:r>
+              <w:t xml:space="preserve">,</w:t>
+            </w:r>
+            <w:r>
+              <w:t xml:space="preserve"> </w:t>
+            </w:r>
+            <w:r>
+              <w:rPr>
+                <w:rStyle w:val="VerbatimChar"/>
+              </w:rPr>
+              <w:t xml:space="preserve">BookingApiWebTest</w:t>
             </w:r>
           </w:p>
         </w:tc>
@@ -15426,7 +16257,7 @@
               <w:pStyle w:val="Compact"/>
             </w:pPr>
             <w:r>
-              <w:t xml:space="preserve">CP-08; live test of October 26 (Table 5e)</w:t>
+              <w:t xml:space="preserve">CP-08, CP-43 to CP-45; live test of October 26 (Table 5e)</w:t>
             </w:r>
           </w:p>
         </w:tc>
@@ -17225,10 +18056,22 @@
               <w:pStyle w:val="Compact"/>
             </w:pPr>
             <w:r>
+              <w:t xml:space="preserve">None:</w:t>
+            </w:r>
+            <w:r>
+              <w:t xml:space="preserve"> </w:t>
+            </w:r>
+            <w:r>
               <w:rPr>
                 <w:rStyle w:val="VerbatimChar"/>
               </w:rPr>
               <w:t xml:space="preserve">/client/history</w:t>
+            </w:r>
+            <w:r>
+              <w:t xml:space="preserve"> </w:t>
+            </w:r>
+            <w:r>
+              <w:t xml:space="preserve">is the booking history</w:t>
             </w:r>
           </w:p>
         </w:tc>
@@ -18418,7 +19261,7 @@
               <w:pStyle w:val="Compact"/>
             </w:pPr>
             <w:r>
-              <w:t xml:space="preserve">Closed: 73 tests in 25 suites with</w:t>
+              <w:t xml:space="preserve">Closed: 106 tests with</w:t>
             </w:r>
             <w:r>
               <w:t xml:space="preserve"> </w:t>
@@ -18434,7 +19277,22 @@
               <w:t xml:space="preserve"> </w:t>
             </w:r>
             <w:r>
-              <w:t xml:space="preserve">in the CI as of October 24, 2026; coverage is not measured yet</w:t>
+              <w:t xml:space="preserve">in the</w:t>
+            </w:r>
+            <w:r>
+              <w:t xml:space="preserve"> </w:t>
+            </w:r>
+            <w:r>
+              <w:rPr>
+                <w:rStyle w:val="VerbatimChar"/>
+              </w:rPr>
+              <w:t xml:space="preserve">main</w:t>
+            </w:r>
+            <w:r>
+              <w:t xml:space="preserve"> </w:t>
+            </w:r>
+            <w:r>
+              <w:t xml:space="preserve">CI of October 27, 2026 (73 in 25 suites on October 24); coverage is not measured yet</w:t>
             </w:r>
           </w:p>
         </w:tc>
@@ -18469,7 +19327,7 @@
               <w:pStyle w:val="Compact"/>
             </w:pPr>
             <w:r>
-              <w:t xml:space="preserve">As of October 24, 2026 there are 212 tests in 66 files, with the real guard and interceptor, the coupon payment, the refresh, and the translations, and coverage in the CI; the booking form is still missing</w:t>
+              <w:t xml:space="preserve">As of October 27, 2026 there are 242 tests in 68 files (212 in 66 on October 24), with the real guard and interceptor, the coupon payment, the refresh, and the translations, and coverage in the CI; the booking form is still missing</w:t>
             </w:r>
           </w:p>
         </w:tc>
@@ -18508,30 +19366,18 @@
               <w:t xml:space="preserve"> </w:t>
             </w:r>
             <w:r>
-              <w:t xml:space="preserve">and passed; those for the indexes of migration 023 have not been run</w:t>
-            </w:r>
-          </w:p>
-        </w:tc>
-        <w:tc>
-          <w:tcPr/>
-          <w:p>
-            <w:pPr>
-              <w:pStyle w:val="Compact"/>
-            </w:pPr>
-            <w:r>
-              <w:t xml:space="preserve">Document in the README how to create the test database and set</w:t>
-            </w:r>
-            <w:r>
-              <w:t xml:space="preserve"> </w:t>
-            </w:r>
-            <w:r>
-              <w:rPr>
-                <w:rStyle w:val="VerbatimChar"/>
-              </w:rPr>
-              <w:t xml:space="preserve">PAYMENT_INTEGRATION_DB</w:t>
-            </w:r>
-            <w:r>
-              <w:t xml:space="preserve">, and run them in GitHub Actions with a SQL Server service</w:t>
+              <w:t xml:space="preserve">and passed; those for the indexes of migration 023 had not been run</w:t>
+            </w:r>
+          </w:p>
+        </w:tc>
+        <w:tc>
+          <w:tcPr/>
+          <w:p>
+            <w:pPr>
+              <w:pStyle w:val="Compact"/>
+            </w:pPr>
+            <w:r>
+              <w:t xml:space="preserve">Closed for payment-service on October 27, 2026: they are 17 integration tests and they run in the CI, in the "Pruebas de integración" job, against SQL Server 2022 with the Liquibase migrations, without skipping any. Doing the same in the other services is still pending</w:t>
             </w:r>
           </w:p>
         </w:tc>
@@ -18973,7 +19819,7 @@
               <w:pStyle w:val="Compact"/>
             </w:pPr>
             <w:r>
-              <w:t xml:space="preserve">Integration tests against SQL Server in the CI (RNF-003): the 047 failure shows they are needed; meanwhile, a live test after each deployment. Booking migration 049 and seed 117 (October 26, 2026) were tested this way, locally and in production: columns in</w:t>
+              <w:t xml:space="preserve">Integration tests against SQL Server in the CI (RNF-003): the 047 failure shows they are needed (since October 27, 2026 payment-service's run; notification's and the other services' are missing); meanwhile, a live test after each deployment. Booking migration 049 and seed 117 (October 26, 2026) were tested this way, locally and in production: columns in</w:t>
             </w:r>
             <w:r>
               <w:t xml:space="preserve"> </w:t>

</xml_diff>